<commit_message>
Documentation quality pass (in progress)
</commit_message>
<xml_diff>
--- a/docs/package/out/BrokerVerse_Business_Continuity_and_Disaster_Recovery_Plan.docx
+++ b/docs/package/out/BrokerVerse_Business_Continuity_and_Disaster_Recovery_Plan.docx
@@ -10,7 +10,7 @@
       <w:r>
         <w:rPr/>
         <w:drawing>
-          <wp:anchor behindDoc="1" distT="0" distB="0" distL="0" distR="0" simplePos="0" locked="0" layoutInCell="0" allowOverlap="1" relativeHeight="27">
+          <wp:anchor behindDoc="1" distT="0" distB="0" distL="0" distR="0" simplePos="0" locked="0" layoutInCell="0" allowOverlap="1" relativeHeight="25">
             <wp:simplePos x="0" y="0"/>
             <wp:positionH relativeFrom="margin">
               <wp:posOffset>-914400</wp:posOffset>
@@ -55,7 +55,7 @@
           </wp:anchor>
         </w:drawing>
         <w:drawing>
-          <wp:anchor behindDoc="1" distT="0" distB="0" distL="0" distR="0" simplePos="0" locked="0" layoutInCell="0" allowOverlap="1" relativeHeight="38">
+          <wp:anchor behindDoc="1" distT="0" distB="0" distL="0" distR="0" simplePos="0" locked="0" layoutInCell="0" allowOverlap="1" relativeHeight="36">
             <wp:simplePos x="0" y="0"/>
             <wp:positionH relativeFrom="margin">
               <wp:align>center</wp:align>
@@ -111,7 +111,7 @@
         <mc:AlternateContent>
           <mc:Choice Requires="wps">
             <w:drawing>
-              <wp:anchor behindDoc="0" distT="45720" distB="45720" distL="114300" distR="114300" simplePos="0" locked="0" layoutInCell="0" allowOverlap="1" relativeHeight="28" wp14:anchorId="3D43415C">
+              <wp:anchor behindDoc="0" distT="45720" distB="45720" distL="114300" distR="114300" simplePos="0" locked="0" layoutInCell="0" allowOverlap="1" relativeHeight="26" wp14:anchorId="3D43415C">
                 <wp:simplePos x="0" y="0"/>
                 <wp:positionH relativeFrom="page">
                   <wp:posOffset>194310</wp:posOffset>
@@ -226,7 +226,7 @@
         <mc:AlternateContent>
           <mc:Choice Requires="wps">
             <w:drawing>
-              <wp:anchor behindDoc="0" distT="45720" distB="45720" distL="113030" distR="114935" simplePos="0" locked="0" layoutInCell="0" allowOverlap="1" relativeHeight="30" wp14:anchorId="58C23128">
+              <wp:anchor behindDoc="0" distT="45720" distB="45720" distL="113030" distR="114935" simplePos="0" locked="0" layoutInCell="0" allowOverlap="1" relativeHeight="28" wp14:anchorId="58C23128">
                 <wp:simplePos x="0" y="0"/>
                 <wp:positionH relativeFrom="page">
                   <wp:posOffset>3094990</wp:posOffset>
@@ -341,7 +341,7 @@
         <mc:AlternateContent>
           <mc:Choice Requires="wps">
             <w:drawing>
-              <wp:anchor behindDoc="0" distT="45720" distB="45720" distL="114300" distR="113665" simplePos="0" locked="0" layoutInCell="0" allowOverlap="1" relativeHeight="32" wp14:anchorId="1BF25123">
+              <wp:anchor behindDoc="0" distT="45720" distB="45720" distL="114300" distR="113665" simplePos="0" locked="0" layoutInCell="0" allowOverlap="1" relativeHeight="30" wp14:anchorId="1BF25123">
                 <wp:simplePos x="0" y="0"/>
                 <wp:positionH relativeFrom="page">
                   <wp:posOffset>4992370</wp:posOffset>
@@ -456,7 +456,7 @@
         <mc:AlternateContent>
           <mc:Choice Requires="wps">
             <w:drawing>
-              <wp:anchor behindDoc="0" distT="45720" distB="46355" distL="114300" distR="114300" simplePos="0" locked="0" layoutInCell="0" allowOverlap="1" relativeHeight="34" wp14:anchorId="01DE2BF4">
+              <wp:anchor behindDoc="0" distT="45720" distB="46355" distL="114300" distR="114300" simplePos="0" locked="0" layoutInCell="0" allowOverlap="1" relativeHeight="32" wp14:anchorId="01DE2BF4">
                 <wp:simplePos x="0" y="0"/>
                 <wp:positionH relativeFrom="margin">
                   <wp:align>center</wp:align>
@@ -601,7 +601,7 @@
         <mc:AlternateContent>
           <mc:Choice Requires="wps">
             <w:drawing>
-              <wp:anchor behindDoc="0" distT="45720" distB="50800" distL="114300" distR="114300" simplePos="0" locked="0" layoutInCell="0" allowOverlap="1" relativeHeight="36" wp14:anchorId="204C02CC">
+              <wp:anchor behindDoc="0" distT="45720" distB="50800" distL="114300" distR="114300" simplePos="0" locked="0" layoutInCell="0" allowOverlap="1" relativeHeight="34" wp14:anchorId="204C02CC">
                 <wp:simplePos x="0" y="0"/>
                 <wp:positionH relativeFrom="margin">
                   <wp:align>center</wp:align>
@@ -789,7 +789,7 @@
             </w:rPr>
             <w:fldChar w:fldCharType="separate"/>
           </w:r>
-          <w:hyperlink w:anchor="__RefHeading___Toc3874_1957936413">
+          <w:hyperlink w:anchor="__RefHeading___Toc11680_4195859891">
             <w:r>
               <w:rPr>
                 <w:webHidden/>
@@ -824,7 +824,7 @@
             </w:tabs>
             <w:rPr/>
           </w:pPr>
-          <w:hyperlink w:anchor="__RefHeading___Toc3876_1957936413">
+          <w:hyperlink w:anchor="__RefHeading___Toc11682_4195859891">
             <w:r>
               <w:rPr>
                 <w:webHidden/>
@@ -853,7 +853,7 @@
             </w:tabs>
             <w:rPr/>
           </w:pPr>
-          <w:hyperlink w:anchor="__RefHeading___Toc3878_1957936413">
+          <w:hyperlink w:anchor="__RefHeading___Toc11684_4195859891">
             <w:r>
               <w:rPr>
                 <w:webHidden/>
@@ -875,7 +875,7 @@
             </w:tabs>
             <w:rPr/>
           </w:pPr>
-          <w:hyperlink w:anchor="__RefHeading___Toc3880_1957936413">
+          <w:hyperlink w:anchor="__RefHeading___Toc11686_4195859891">
             <w:r>
               <w:rPr>
                 <w:webHidden/>
@@ -897,7 +897,7 @@
             </w:tabs>
             <w:rPr/>
           </w:pPr>
-          <w:hyperlink w:anchor="__RefHeading___Toc3882_1957936413">
+          <w:hyperlink w:anchor="__RefHeading___Toc11688_4195859891">
             <w:r>
               <w:rPr>
                 <w:webHidden/>
@@ -919,7 +919,7 @@
             </w:tabs>
             <w:rPr/>
           </w:pPr>
-          <w:hyperlink w:anchor="__RefHeading___Toc3884_1957936413">
+          <w:hyperlink w:anchor="__RefHeading___Toc11690_4195859891">
             <w:r>
               <w:rPr>
                 <w:webHidden/>
@@ -941,7 +941,7 @@
             </w:tabs>
             <w:rPr/>
           </w:pPr>
-          <w:hyperlink w:anchor="__RefHeading___Toc3886_1957936413">
+          <w:hyperlink w:anchor="__RefHeading___Toc11692_4195859891">
             <w:r>
               <w:rPr>
                 <w:webHidden/>
@@ -963,7 +963,7 @@
             </w:tabs>
             <w:rPr/>
           </w:pPr>
-          <w:hyperlink w:anchor="__RefHeading___Toc3888_1957936413">
+          <w:hyperlink w:anchor="__RefHeading___Toc11694_4195859891">
             <w:r>
               <w:rPr>
                 <w:webHidden/>
@@ -985,7 +985,7 @@
             </w:tabs>
             <w:rPr/>
           </w:pPr>
-          <w:hyperlink w:anchor="__RefHeading___Toc3890_1957936413">
+          <w:hyperlink w:anchor="__RefHeading___Toc11696_4195859891">
             <w:r>
               <w:rPr>
                 <w:webHidden/>
@@ -1007,7 +1007,7 @@
             </w:tabs>
             <w:rPr/>
           </w:pPr>
-          <w:hyperlink w:anchor="__RefHeading___Toc3892_1957936413">
+          <w:hyperlink w:anchor="__RefHeading___Toc11698_4195859891">
             <w:r>
               <w:rPr>
                 <w:webHidden/>
@@ -1015,7 +1015,7 @@
               </w:rPr>
               <w:t>5. Recovery objectives</w:t>
               <w:tab/>
-              <w:t>9</w:t>
+              <w:t>8</w:t>
             </w:r>
           </w:hyperlink>
         </w:p>
@@ -1029,7 +1029,7 @@
             </w:tabs>
             <w:rPr/>
           </w:pPr>
-          <w:hyperlink w:anchor="__RefHeading___Toc3894_1957936413">
+          <w:hyperlink w:anchor="__RefHeading___Toc11700_4195859891">
             <w:r>
               <w:rPr>
                 <w:webHidden/>
@@ -1037,7 +1037,7 @@
               </w:rPr>
               <w:t>5.1 Objectives by scenario</w:t>
               <w:tab/>
-              <w:t>9</w:t>
+              <w:t>8</w:t>
             </w:r>
           </w:hyperlink>
         </w:p>
@@ -1051,7 +1051,7 @@
             </w:tabs>
             <w:rPr/>
           </w:pPr>
-          <w:hyperlink w:anchor="__RefHeading___Toc3896_1957936413">
+          <w:hyperlink w:anchor="__RefHeading___Toc11702_4195859891">
             <w:r>
               <w:rPr>
                 <w:webHidden/>
@@ -1059,7 +1059,7 @@
               </w:rPr>
               <w:t>5.2 Objectives by hosting option</w:t>
               <w:tab/>
-              <w:t>9</w:t>
+              <w:t>8</w:t>
             </w:r>
           </w:hyperlink>
         </w:p>
@@ -1073,7 +1073,7 @@
             </w:tabs>
             <w:rPr/>
           </w:pPr>
-          <w:hyperlink w:anchor="__RefHeading___Toc3898_1957936413">
+          <w:hyperlink w:anchor="__RefHeading___Toc11704_4195859891">
             <w:r>
               <w:rPr>
                 <w:webHidden/>
@@ -1081,7 +1081,7 @@
               </w:rPr>
               <w:t>5.3 Availability target</w:t>
               <w:tab/>
-              <w:t>10</w:t>
+              <w:t>9</w:t>
             </w:r>
           </w:hyperlink>
         </w:p>
@@ -1095,7 +1095,7 @@
             </w:tabs>
             <w:rPr/>
           </w:pPr>
-          <w:hyperlink w:anchor="__RefHeading___Toc3900_1957936413">
+          <w:hyperlink w:anchor="__RefHeading___Toc11706_4195859891">
             <w:r>
               <w:rPr>
                 <w:webHidden/>
@@ -1103,7 +1103,7 @@
               </w:rPr>
               <w:t>6. Backup scheme</w:t>
               <w:tab/>
-              <w:t>11</w:t>
+              <w:t>10</w:t>
             </w:r>
           </w:hyperlink>
         </w:p>
@@ -1117,7 +1117,7 @@
             </w:tabs>
             <w:rPr/>
           </w:pPr>
-          <w:hyperlink w:anchor="__RefHeading___Toc3902_1957936413">
+          <w:hyperlink w:anchor="__RefHeading___Toc11708_4195859891">
             <w:r>
               <w:rPr>
                 <w:webHidden/>
@@ -1125,7 +1125,7 @@
               </w:rPr>
               <w:t>6.1 Backups</w:t>
               <w:tab/>
-              <w:t>11</w:t>
+              <w:t>10</w:t>
             </w:r>
           </w:hyperlink>
         </w:p>
@@ -1139,7 +1139,7 @@
             </w:tabs>
             <w:rPr/>
           </w:pPr>
-          <w:hyperlink w:anchor="__RefHeading___Toc3904_1957936413">
+          <w:hyperlink w:anchor="__RefHeading___Toc11710_4195859891">
             <w:r>
               <w:rPr>
                 <w:webHidden/>
@@ -1147,7 +1147,7 @@
               </w:rPr>
               <w:t>6.2 Why the encryption key matters</w:t>
               <w:tab/>
-              <w:t>11</w:t>
+              <w:t>10</w:t>
             </w:r>
           </w:hyperlink>
         </w:p>
@@ -1161,7 +1161,7 @@
             </w:tabs>
             <w:rPr/>
           </w:pPr>
-          <w:hyperlink w:anchor="__RefHeading___Toc3906_1957936413">
+          <w:hyperlink w:anchor="__RefHeading___Toc11712_4195859891">
             <w:r>
               <w:rPr>
                 <w:webHidden/>
@@ -1169,7 +1169,7 @@
               </w:rPr>
               <w:t>7. Restore procedures</w:t>
               <w:tab/>
-              <w:t>12</w:t>
+              <w:t>11</w:t>
             </w:r>
           </w:hyperlink>
         </w:p>
@@ -1183,7 +1183,7 @@
             </w:tabs>
             <w:rPr/>
           </w:pPr>
-          <w:hyperlink w:anchor="__RefHeading___Toc3908_1957936413">
+          <w:hyperlink w:anchor="__RefHeading___Toc11714_4195859891">
             <w:r>
               <w:rPr>
                 <w:webHidden/>
@@ -1191,7 +1191,7 @@
               </w:rPr>
               <w:t>7.1 Common steps for every restore</w:t>
               <w:tab/>
-              <w:t>12</w:t>
+              <w:t>11</w:t>
             </w:r>
           </w:hyperlink>
         </w:p>
@@ -1205,7 +1205,7 @@
             </w:tabs>
             <w:rPr/>
           </w:pPr>
-          <w:hyperlink w:anchor="__RefHeading___Toc3910_1957936413">
+          <w:hyperlink w:anchor="__RefHeading___Toc11716_4195859891">
             <w:r>
               <w:rPr>
                 <w:webHidden/>
@@ -1213,7 +1213,7 @@
               </w:rPr>
               <w:t>7.2 Business checks after a restore</w:t>
               <w:tab/>
-              <w:t>12</w:t>
+              <w:t>11</w:t>
             </w:r>
           </w:hyperlink>
         </w:p>
@@ -1227,7 +1227,7 @@
             </w:tabs>
             <w:rPr/>
           </w:pPr>
-          <w:hyperlink w:anchor="__RefHeading___Toc3912_1957936413">
+          <w:hyperlink w:anchor="__RefHeading___Toc11718_4195859891">
             <w:r>
               <w:rPr>
                 <w:webHidden/>
@@ -1235,7 +1235,7 @@
               </w:rPr>
               <w:t>7.3 Database: point-in-time recovery</w:t>
               <w:tab/>
-              <w:t>12</w:t>
+              <w:t>11</w:t>
             </w:r>
           </w:hyperlink>
         </w:p>
@@ -1249,7 +1249,7 @@
             </w:tabs>
             <w:rPr/>
           </w:pPr>
-          <w:hyperlink w:anchor="__RefHeading___Toc3914_1957936413">
+          <w:hyperlink w:anchor="__RefHeading___Toc11720_4195859891">
             <w:r>
               <w:rPr>
                 <w:webHidden/>
@@ -1257,7 +1257,7 @@
               </w:rPr>
               <w:t>7.4 Database: snapshot or logical dump</w:t>
               <w:tab/>
-              <w:t>13</w:t>
+              <w:t>12</w:t>
             </w:r>
           </w:hyperlink>
         </w:p>
@@ -1271,7 +1271,7 @@
             </w:tabs>
             <w:rPr/>
           </w:pPr>
-          <w:hyperlink w:anchor="__RefHeading___Toc3916_1957936413">
+          <w:hyperlink w:anchor="__RefHeading___Toc11722_4195859891">
             <w:r>
               <w:rPr>
                 <w:webHidden/>
@@ -1279,7 +1279,7 @@
               </w:rPr>
               <w:t>7.5 File store</w:t>
               <w:tab/>
-              <w:t>13</w:t>
+              <w:t>12</w:t>
             </w:r>
           </w:hyperlink>
         </w:p>
@@ -1293,7 +1293,7 @@
             </w:tabs>
             <w:rPr/>
           </w:pPr>
-          <w:hyperlink w:anchor="__RefHeading___Toc3918_1957936413">
+          <w:hyperlink w:anchor="__RefHeading___Toc11724_4195859891">
             <w:r>
               <w:rPr>
                 <w:webHidden/>
@@ -1301,7 +1301,7 @@
               </w:rPr>
               <w:t>7.6 Region or site loss</w:t>
               <w:tab/>
-              <w:t>13</w:t>
+              <w:t>12</w:t>
             </w:r>
           </w:hyperlink>
         </w:p>
@@ -1315,7 +1315,7 @@
             </w:tabs>
             <w:rPr/>
           </w:pPr>
-          <w:hyperlink w:anchor="__RefHeading___Toc3920_1957936413">
+          <w:hyperlink w:anchor="__RefHeading___Toc11726_4195859891">
             <w:r>
               <w:rPr>
                 <w:webHidden/>
@@ -1323,7 +1323,7 @@
               </w:rPr>
               <w:t>7.7 Front end and secrets</w:t>
               <w:tab/>
-              <w:t>13</w:t>
+              <w:t>12</w:t>
             </w:r>
           </w:hyperlink>
         </w:p>
@@ -1337,7 +1337,7 @@
             </w:tabs>
             <w:rPr/>
           </w:pPr>
-          <w:hyperlink w:anchor="__RefHeading___Toc3922_1957936413">
+          <w:hyperlink w:anchor="__RefHeading___Toc11728_4195859891">
             <w:r>
               <w:rPr>
                 <w:webHidden/>
@@ -1345,7 +1345,7 @@
               </w:rPr>
               <w:t>7.8 Release rollback</w:t>
               <w:tab/>
-              <w:t>14</w:t>
+              <w:t>13</w:t>
             </w:r>
           </w:hyperlink>
         </w:p>
@@ -1359,7 +1359,7 @@
             </w:tabs>
             <w:rPr/>
           </w:pPr>
-          <w:hyperlink w:anchor="__RefHeading___Toc3924_1957936413">
+          <w:hyperlink w:anchor="__RefHeading___Toc11730_4195859891">
             <w:r>
               <w:rPr>
                 <w:webHidden/>
@@ -1367,7 +1367,7 @@
               </w:rPr>
               <w:t>8. Scenarios</w:t>
               <w:tab/>
-              <w:t>15</w:t>
+              <w:t>14</w:t>
             </w:r>
           </w:hyperlink>
         </w:p>
@@ -1381,7 +1381,7 @@
             </w:tabs>
             <w:rPr/>
           </w:pPr>
-          <w:hyperlink w:anchor="__RefHeading___Toc3926_1957936413">
+          <w:hyperlink w:anchor="__RefHeading___Toc11732_4195859891">
             <w:r>
               <w:rPr>
                 <w:webHidden/>
@@ -1389,7 +1389,7 @@
               </w:rPr>
               <w:t>8.1 Region or data centre outage</w:t>
               <w:tab/>
-              <w:t>15</w:t>
+              <w:t>14</w:t>
             </w:r>
           </w:hyperlink>
         </w:p>
@@ -1403,7 +1403,7 @@
             </w:tabs>
             <w:rPr/>
           </w:pPr>
-          <w:hyperlink w:anchor="__RefHeading___Toc3928_1957936413">
+          <w:hyperlink w:anchor="__RefHeading___Toc11734_4195859891">
             <w:r>
               <w:rPr>
                 <w:webHidden/>
@@ -1411,7 +1411,7 @@
               </w:rPr>
               <w:t>8.2 Database corruption or wrong mass change</w:t>
               <w:tab/>
-              <w:t>15</w:t>
+              <w:t>14</w:t>
             </w:r>
           </w:hyperlink>
         </w:p>
@@ -1425,7 +1425,7 @@
             </w:tabs>
             <w:rPr/>
           </w:pPr>
-          <w:hyperlink w:anchor="__RefHeading___Toc3930_1957936413">
+          <w:hyperlink w:anchor="__RefHeading___Toc11736_4195859891">
             <w:r>
               <w:rPr>
                 <w:webHidden/>
@@ -1433,7 +1433,7 @@
               </w:rPr>
               <w:t>8.3 Ransomware or destructive attack</w:t>
               <w:tab/>
-              <w:t>15</w:t>
+              <w:t>14</w:t>
             </w:r>
           </w:hyperlink>
         </w:p>
@@ -1447,7 +1447,7 @@
             </w:tabs>
             <w:rPr/>
           </w:pPr>
-          <w:hyperlink w:anchor="__RefHeading___Toc3932_1957936413">
+          <w:hyperlink w:anchor="__RefHeading___Toc11738_4195859891">
             <w:r>
               <w:rPr>
                 <w:webHidden/>
@@ -1455,7 +1455,7 @@
               </w:rPr>
               <w:t>8.4 Key person loss</w:t>
               <w:tab/>
-              <w:t>16</w:t>
+              <w:t>15</w:t>
             </w:r>
           </w:hyperlink>
         </w:p>
@@ -1469,7 +1469,7 @@
             </w:tabs>
             <w:rPr/>
           </w:pPr>
-          <w:hyperlink w:anchor="__RefHeading___Toc3934_1957936413">
+          <w:hyperlink w:anchor="__RefHeading___Toc11740_4195859891">
             <w:r>
               <w:rPr>
                 <w:webHidden/>
@@ -1477,7 +1477,7 @@
               </w:rPr>
               <w:t>8.5 Vendor exit or failure</w:t>
               <w:tab/>
-              <w:t>16</w:t>
+              <w:t>15</w:t>
             </w:r>
           </w:hyperlink>
         </w:p>
@@ -1491,7 +1491,7 @@
             </w:tabs>
             <w:rPr/>
           </w:pPr>
-          <w:hyperlink w:anchor="__RefHeading___Toc3936_1957936413">
+          <w:hyperlink w:anchor="__RefHeading___Toc11742_4195859891">
             <w:r>
               <w:rPr>
                 <w:webHidden/>
@@ -1499,7 +1499,7 @@
               </w:rPr>
               <w:t>8.6 Third-party outages</w:t>
               <w:tab/>
-              <w:t>16</w:t>
+              <w:t>15</w:t>
             </w:r>
           </w:hyperlink>
         </w:p>
@@ -1513,7 +1513,7 @@
             </w:tabs>
             <w:rPr/>
           </w:pPr>
-          <w:hyperlink w:anchor="__RefHeading___Toc3938_1957936413">
+          <w:hyperlink w:anchor="__RefHeading___Toc11744_4195859891">
             <w:r>
               <w:rPr>
                 <w:webHidden/>
@@ -1521,7 +1521,7 @@
               </w:rPr>
               <w:t>9. Manual workarounds while the system is down</w:t>
               <w:tab/>
-              <w:t>17</w:t>
+              <w:t>16</w:t>
             </w:r>
           </w:hyperlink>
         </w:p>
@@ -1535,7 +1535,7 @@
             </w:tabs>
             <w:rPr/>
           </w:pPr>
-          <w:hyperlink w:anchor="__RefHeading___Toc3940_1957936413">
+          <w:hyperlink w:anchor="__RefHeading___Toc11746_4195859891">
             <w:r>
               <w:rPr>
                 <w:webHidden/>
@@ -1543,7 +1543,7 @@
               </w:rPr>
               <w:t>10. Roles and responsibilities</w:t>
               <w:tab/>
-              <w:t>18</w:t>
+              <w:t>17</w:t>
             </w:r>
           </w:hyperlink>
         </w:p>
@@ -1557,7 +1557,7 @@
             </w:tabs>
             <w:rPr/>
           </w:pPr>
-          <w:hyperlink w:anchor="__RefHeading___Toc3942_1957936413">
+          <w:hyperlink w:anchor="__RefHeading___Toc11748_4195859891">
             <w:r>
               <w:rPr>
                 <w:webHidden/>
@@ -1565,7 +1565,7 @@
               </w:rPr>
               <w:t>11. Communication</w:t>
               <w:tab/>
-              <w:t>19</w:t>
+              <w:t>18</w:t>
             </w:r>
           </w:hyperlink>
         </w:p>
@@ -1579,7 +1579,7 @@
             </w:tabs>
             <w:rPr/>
           </w:pPr>
-          <w:hyperlink w:anchor="__RefHeading___Toc3944_1957936413">
+          <w:hyperlink w:anchor="__RefHeading___Toc11750_4195859891">
             <w:r>
               <w:rPr>
                 <w:webHidden/>
@@ -1587,7 +1587,7 @@
               </w:rPr>
               <w:t>12. DR drills and evidence</w:t>
               <w:tab/>
-              <w:t>20</w:t>
+              <w:t>19</w:t>
             </w:r>
           </w:hyperlink>
         </w:p>
@@ -1601,7 +1601,7 @@
             </w:tabs>
             <w:rPr/>
           </w:pPr>
-          <w:hyperlink w:anchor="__RefHeading___Toc3946_1957936413">
+          <w:hyperlink w:anchor="__RefHeading___Toc11752_4195859891">
             <w:r>
               <w:rPr>
                 <w:webHidden/>
@@ -1609,7 +1609,7 @@
               </w:rPr>
               <w:t>12.1 Drill calendar</w:t>
               <w:tab/>
-              <w:t>20</w:t>
+              <w:t>19</w:t>
             </w:r>
           </w:hyperlink>
         </w:p>
@@ -1623,7 +1623,7 @@
             </w:tabs>
             <w:rPr/>
           </w:pPr>
-          <w:hyperlink w:anchor="__RefHeading___Toc3948_1957936413">
+          <w:hyperlink w:anchor="__RefHeading___Toc11754_4195859891">
             <w:r>
               <w:rPr>
                 <w:webHidden/>
@@ -1631,7 +1631,7 @@
               </w:rPr>
               <w:t>12.2 Evidence kept</w:t>
               <w:tab/>
-              <w:t>20</w:t>
+              <w:t>19</w:t>
             </w:r>
           </w:hyperlink>
         </w:p>
@@ -1645,7 +1645,7 @@
             </w:tabs>
             <w:rPr/>
           </w:pPr>
-          <w:hyperlink w:anchor="__RefHeading___Toc3950_1957936413">
+          <w:hyperlink w:anchor="__RefHeading___Toc11756_4195859891">
             <w:r>
               <w:rPr>
                 <w:webHidden/>
@@ -1653,7 +1653,7 @@
               </w:rPr>
               <w:t>13. Maintaining this plan</w:t>
               <w:tab/>
-              <w:t>21</w:t>
+              <w:t>20</w:t>
             </w:r>
           </w:hyperlink>
         </w:p>
@@ -1667,7 +1667,7 @@
             </w:tabs>
             <w:rPr/>
           </w:pPr>
-          <w:hyperlink w:anchor="__RefHeading___Toc3952_1957936413">
+          <w:hyperlink w:anchor="__RefHeading___Toc11758_4195859891">
             <w:r>
               <w:rPr>
                 <w:webHidden/>
@@ -1682,7 +1682,7 @@
                 <w:rStyle w:val="IndexLink"/>
               </w:rPr>
               <w:tab/>
-              <w:t>22</w:t>
+              <w:t>21</w:t>
             </w:r>
           </w:hyperlink>
           <w:r>
@@ -1715,7 +1715,7 @@
       <w:r>
         <w:br w:type="page"/>
       </w:r>
-      <w:bookmarkStart w:id="0" w:name="__RefHeading___Toc3874_1957936413"/>
+      <w:bookmarkStart w:id="0" w:name="__RefHeading___Toc11680_4195859891"/>
       <w:bookmarkStart w:id="1" w:name="_Toc48319687"/>
       <w:bookmarkStart w:id="2" w:name="_Toc11824118"/>
       <w:bookmarkEnd w:id="0"/>
@@ -2358,7 +2358,7 @@
           <w:spacing w:val="0"/>
         </w:rPr>
       </w:pPr>
-      <w:bookmarkStart w:id="4" w:name="__RefHeading___Toc3876_1957936413"/>
+      <w:bookmarkStart w:id="4" w:name="__RefHeading___Toc11682_4195859891"/>
       <w:bookmarkStart w:id="5" w:name="_Toc233203388"/>
       <w:bookmarkEnd w:id="4"/>
       <w:r>
@@ -4216,7 +4216,7 @@
         <w:pageBreakBefore w:val="false"/>
         <w:rPr/>
       </w:pPr>
-      <w:bookmarkStart w:id="6" w:name="__RefHeading___Toc3878_1957936413"/>
+      <w:bookmarkStart w:id="6" w:name="__RefHeading___Toc11684_4195859891"/>
       <w:bookmarkEnd w:id="6"/>
       <w:r>
         <w:rPr>
@@ -4233,7 +4233,7 @@
         <w:pStyle w:val="Heading2"/>
         <w:rPr/>
       </w:pPr>
-      <w:bookmarkStart w:id="7" w:name="__RefHeading___Toc3880_1957936413"/>
+      <w:bookmarkStart w:id="7" w:name="__RefHeading___Toc11686_4195859891"/>
       <w:bookmarkEnd w:id="7"/>
       <w:r>
         <w:rPr>
@@ -4280,7 +4280,7 @@
         <w:pStyle w:val="Heading2"/>
         <w:rPr/>
       </w:pPr>
-      <w:bookmarkStart w:id="8" w:name="__RefHeading___Toc3882_1957936413"/>
+      <w:bookmarkStart w:id="8" w:name="__RefHeading___Toc11688_4195859891"/>
       <w:bookmarkEnd w:id="8"/>
       <w:r>
         <w:rPr>
@@ -4383,7 +4383,7 @@
         <w:pStyle w:val="Heading2"/>
         <w:rPr/>
       </w:pPr>
-      <w:bookmarkStart w:id="9" w:name="__RefHeading___Toc3884_1957936413"/>
+      <w:bookmarkStart w:id="9" w:name="__RefHeading___Toc11690_4195859891"/>
       <w:bookmarkEnd w:id="9"/>
       <w:r>
         <w:rPr>
@@ -4824,7 +4824,7 @@
         <w:pStyle w:val="Heading1"/>
         <w:rPr/>
       </w:pPr>
-      <w:bookmarkStart w:id="10" w:name="__RefHeading___Toc3886_1957936413"/>
+      <w:bookmarkStart w:id="10" w:name="__RefHeading___Toc11692_4195859891"/>
       <w:bookmarkEnd w:id="10"/>
       <w:r>
         <w:rPr>
@@ -4841,7 +4841,7 @@
         <w:pStyle w:val="Heading2"/>
         <w:rPr/>
       </w:pPr>
-      <w:bookmarkStart w:id="11" w:name="__RefHeading___Toc3888_1957936413"/>
+      <w:bookmarkStart w:id="11" w:name="__RefHeading___Toc11694_4195859891"/>
       <w:bookmarkEnd w:id="11"/>
       <w:r>
         <w:rPr>
@@ -4871,7 +4871,7 @@
     <w:tbl>
       <w:tblPr>
         <w:tblStyle w:val="TableGrid"/>
-        <w:tblW w:w="9014" w:type="dxa"/>
+        <w:tblW w:w="9015" w:type="dxa"/>
         <w:jc w:val="left"/>
         <w:tblInd w:w="0" w:type="dxa"/>
         <w:tblLayout w:type="fixed"/>
@@ -4885,9 +4885,9 @@
       </w:tblPr>
       <w:tblGrid>
         <w:gridCol w:w="906"/>
-        <w:gridCol w:w="2283"/>
-        <w:gridCol w:w="2881"/>
-        <w:gridCol w:w="2943"/>
+        <w:gridCol w:w="2747"/>
+        <w:gridCol w:w="2658"/>
+        <w:gridCol w:w="2703"/>
       </w:tblGrid>
       <w:tr>
         <w:trPr>
@@ -4934,7 +4934,7 @@
         </w:tc>
         <w:tc>
           <w:tcPr>
-            <w:tcW w:w="2283" w:type="dxa"/>
+            <w:tcW w:w="2747" w:type="dxa"/>
             <w:tcBorders>
               <w:top w:val="single" w:sz="4" w:space="0" w:color="BFC7D1"/>
               <w:left w:val="single" w:sz="4" w:space="0" w:color="BFC7D1"/>
@@ -4973,7 +4973,7 @@
         </w:tc>
         <w:tc>
           <w:tcPr>
-            <w:tcW w:w="2881" w:type="dxa"/>
+            <w:tcW w:w="2658" w:type="dxa"/>
             <w:tcBorders>
               <w:top w:val="single" w:sz="4" w:space="0" w:color="BFC7D1"/>
               <w:left w:val="single" w:sz="4" w:space="0" w:color="BFC7D1"/>
@@ -5012,7 +5012,7 @@
         </w:tc>
         <w:tc>
           <w:tcPr>
-            <w:tcW w:w="2943" w:type="dxa"/>
+            <w:tcW w:w="2703" w:type="dxa"/>
             <w:tcBorders>
               <w:top w:val="single" w:sz="4" w:space="0" w:color="BFC7D1"/>
               <w:left w:val="single" w:sz="4" w:space="0" w:color="BFC7D1"/>
@@ -5091,7 +5091,7 @@
         </w:tc>
         <w:tc>
           <w:tcPr>
-            <w:tcW w:w="2283" w:type="dxa"/>
+            <w:tcW w:w="2747" w:type="dxa"/>
             <w:tcBorders>
               <w:top w:val="single" w:sz="4" w:space="0" w:color="BFC7D1"/>
               <w:left w:val="single" w:sz="4" w:space="0" w:color="BFC7D1"/>
@@ -5128,7 +5128,7 @@
         </w:tc>
         <w:tc>
           <w:tcPr>
-            <w:tcW w:w="2881" w:type="dxa"/>
+            <w:tcW w:w="2658" w:type="dxa"/>
             <w:tcBorders>
               <w:top w:val="single" w:sz="4" w:space="0" w:color="BFC7D1"/>
               <w:left w:val="single" w:sz="4" w:space="0" w:color="BFC7D1"/>
@@ -5165,7 +5165,7 @@
         </w:tc>
         <w:tc>
           <w:tcPr>
-            <w:tcW w:w="2943" w:type="dxa"/>
+            <w:tcW w:w="2703" w:type="dxa"/>
             <w:tcBorders>
               <w:top w:val="single" w:sz="4" w:space="0" w:color="BFC7D1"/>
               <w:left w:val="single" w:sz="4" w:space="0" w:color="BFC7D1"/>
@@ -5242,7 +5242,7 @@
         </w:tc>
         <w:tc>
           <w:tcPr>
-            <w:tcW w:w="2283" w:type="dxa"/>
+            <w:tcW w:w="2747" w:type="dxa"/>
             <w:tcBorders>
               <w:top w:val="single" w:sz="4" w:space="0" w:color="BFC7D1"/>
               <w:left w:val="single" w:sz="4" w:space="0" w:color="BFC7D1"/>
@@ -5279,7 +5279,7 @@
         </w:tc>
         <w:tc>
           <w:tcPr>
-            <w:tcW w:w="2881" w:type="dxa"/>
+            <w:tcW w:w="2658" w:type="dxa"/>
             <w:tcBorders>
               <w:top w:val="single" w:sz="4" w:space="0" w:color="BFC7D1"/>
               <w:left w:val="single" w:sz="4" w:space="0" w:color="BFC7D1"/>
@@ -5316,7 +5316,7 @@
         </w:tc>
         <w:tc>
           <w:tcPr>
-            <w:tcW w:w="2943" w:type="dxa"/>
+            <w:tcW w:w="2703" w:type="dxa"/>
             <w:tcBorders>
               <w:top w:val="single" w:sz="4" w:space="0" w:color="BFC7D1"/>
               <w:left w:val="single" w:sz="4" w:space="0" w:color="BFC7D1"/>
@@ -5393,7 +5393,7 @@
         </w:tc>
         <w:tc>
           <w:tcPr>
-            <w:tcW w:w="2283" w:type="dxa"/>
+            <w:tcW w:w="2747" w:type="dxa"/>
             <w:tcBorders>
               <w:top w:val="single" w:sz="4" w:space="0" w:color="BFC7D1"/>
               <w:left w:val="single" w:sz="4" w:space="0" w:color="BFC7D1"/>
@@ -5430,7 +5430,7 @@
         </w:tc>
         <w:tc>
           <w:tcPr>
-            <w:tcW w:w="2881" w:type="dxa"/>
+            <w:tcW w:w="2658" w:type="dxa"/>
             <w:tcBorders>
               <w:top w:val="single" w:sz="4" w:space="0" w:color="BFC7D1"/>
               <w:left w:val="single" w:sz="4" w:space="0" w:color="BFC7D1"/>
@@ -5467,7 +5467,7 @@
         </w:tc>
         <w:tc>
           <w:tcPr>
-            <w:tcW w:w="2943" w:type="dxa"/>
+            <w:tcW w:w="2703" w:type="dxa"/>
             <w:tcBorders>
               <w:top w:val="single" w:sz="4" w:space="0" w:color="BFC7D1"/>
               <w:left w:val="single" w:sz="4" w:space="0" w:color="BFC7D1"/>
@@ -5544,7 +5544,7 @@
         </w:tc>
         <w:tc>
           <w:tcPr>
-            <w:tcW w:w="2283" w:type="dxa"/>
+            <w:tcW w:w="2747" w:type="dxa"/>
             <w:tcBorders>
               <w:top w:val="single" w:sz="4" w:space="0" w:color="BFC7D1"/>
               <w:left w:val="single" w:sz="4" w:space="0" w:color="BFC7D1"/>
@@ -5581,7 +5581,7 @@
         </w:tc>
         <w:tc>
           <w:tcPr>
-            <w:tcW w:w="2881" w:type="dxa"/>
+            <w:tcW w:w="2658" w:type="dxa"/>
             <w:tcBorders>
               <w:top w:val="single" w:sz="4" w:space="0" w:color="BFC7D1"/>
               <w:left w:val="single" w:sz="4" w:space="0" w:color="BFC7D1"/>
@@ -5618,7 +5618,7 @@
         </w:tc>
         <w:tc>
           <w:tcPr>
-            <w:tcW w:w="2943" w:type="dxa"/>
+            <w:tcW w:w="2703" w:type="dxa"/>
             <w:tcBorders>
               <w:top w:val="single" w:sz="4" w:space="0" w:color="BFC7D1"/>
               <w:left w:val="single" w:sz="4" w:space="0" w:color="BFC7D1"/>
@@ -5695,7 +5695,7 @@
         </w:tc>
         <w:tc>
           <w:tcPr>
-            <w:tcW w:w="2283" w:type="dxa"/>
+            <w:tcW w:w="2747" w:type="dxa"/>
             <w:tcBorders>
               <w:top w:val="single" w:sz="4" w:space="0" w:color="BFC7D1"/>
               <w:left w:val="single" w:sz="4" w:space="0" w:color="BFC7D1"/>
@@ -5732,7 +5732,7 @@
         </w:tc>
         <w:tc>
           <w:tcPr>
-            <w:tcW w:w="2881" w:type="dxa"/>
+            <w:tcW w:w="2658" w:type="dxa"/>
             <w:tcBorders>
               <w:top w:val="single" w:sz="4" w:space="0" w:color="BFC7D1"/>
               <w:left w:val="single" w:sz="4" w:space="0" w:color="BFC7D1"/>
@@ -5769,7 +5769,7 @@
         </w:tc>
         <w:tc>
           <w:tcPr>
-            <w:tcW w:w="2943" w:type="dxa"/>
+            <w:tcW w:w="2703" w:type="dxa"/>
             <w:tcBorders>
               <w:top w:val="single" w:sz="4" w:space="0" w:color="BFC7D1"/>
               <w:left w:val="single" w:sz="4" w:space="0" w:color="BFC7D1"/>
@@ -5846,7 +5846,7 @@
         </w:tc>
         <w:tc>
           <w:tcPr>
-            <w:tcW w:w="2283" w:type="dxa"/>
+            <w:tcW w:w="2747" w:type="dxa"/>
             <w:tcBorders>
               <w:top w:val="single" w:sz="4" w:space="0" w:color="BFC7D1"/>
               <w:left w:val="single" w:sz="4" w:space="0" w:color="BFC7D1"/>
@@ -5883,7 +5883,7 @@
         </w:tc>
         <w:tc>
           <w:tcPr>
-            <w:tcW w:w="2881" w:type="dxa"/>
+            <w:tcW w:w="2658" w:type="dxa"/>
             <w:tcBorders>
               <w:top w:val="single" w:sz="4" w:space="0" w:color="BFC7D1"/>
               <w:left w:val="single" w:sz="4" w:space="0" w:color="BFC7D1"/>
@@ -5920,7 +5920,7 @@
         </w:tc>
         <w:tc>
           <w:tcPr>
-            <w:tcW w:w="2943" w:type="dxa"/>
+            <w:tcW w:w="2703" w:type="dxa"/>
             <w:tcBorders>
               <w:top w:val="single" w:sz="4" w:space="0" w:color="BFC7D1"/>
               <w:left w:val="single" w:sz="4" w:space="0" w:color="BFC7D1"/>
@@ -5997,7 +5997,7 @@
         </w:tc>
         <w:tc>
           <w:tcPr>
-            <w:tcW w:w="2283" w:type="dxa"/>
+            <w:tcW w:w="2747" w:type="dxa"/>
             <w:tcBorders>
               <w:top w:val="single" w:sz="4" w:space="0" w:color="BFC7D1"/>
               <w:left w:val="single" w:sz="4" w:space="0" w:color="BFC7D1"/>
@@ -6034,7 +6034,7 @@
         </w:tc>
         <w:tc>
           <w:tcPr>
-            <w:tcW w:w="2881" w:type="dxa"/>
+            <w:tcW w:w="2658" w:type="dxa"/>
             <w:tcBorders>
               <w:top w:val="single" w:sz="4" w:space="0" w:color="BFC7D1"/>
               <w:left w:val="single" w:sz="4" w:space="0" w:color="BFC7D1"/>
@@ -6071,7 +6071,7 @@
         </w:tc>
         <w:tc>
           <w:tcPr>
-            <w:tcW w:w="2943" w:type="dxa"/>
+            <w:tcW w:w="2703" w:type="dxa"/>
             <w:tcBorders>
               <w:top w:val="single" w:sz="4" w:space="0" w:color="BFC7D1"/>
               <w:left w:val="single" w:sz="4" w:space="0" w:color="BFC7D1"/>
@@ -6149,7 +6149,7 @@
         <w:pStyle w:val="Heading2"/>
         <w:rPr/>
       </w:pPr>
-      <w:bookmarkStart w:id="12" w:name="__RefHeading___Toc3890_1957936413"/>
+      <w:bookmarkStart w:id="12" w:name="__RefHeading___Toc11696_4195859891"/>
       <w:bookmarkEnd w:id="12"/>
       <w:r>
         <w:rPr>
@@ -6178,9 +6178,9 @@
       </w:tblPr>
       <w:tblGrid>
         <w:gridCol w:w="906"/>
-        <w:gridCol w:w="2260"/>
-        <w:gridCol w:w="2925"/>
-        <w:gridCol w:w="2923"/>
+        <w:gridCol w:w="2745"/>
+        <w:gridCol w:w="2689"/>
+        <w:gridCol w:w="2674"/>
       </w:tblGrid>
       <w:tr>
         <w:trPr>
@@ -6227,7 +6227,7 @@
         </w:tc>
         <w:tc>
           <w:tcPr>
-            <w:tcW w:w="2260" w:type="dxa"/>
+            <w:tcW w:w="2745" w:type="dxa"/>
             <w:tcBorders>
               <w:top w:val="single" w:sz="4" w:space="0" w:color="BFC7D1"/>
               <w:left w:val="single" w:sz="4" w:space="0" w:color="BFC7D1"/>
@@ -6266,7 +6266,7 @@
         </w:tc>
         <w:tc>
           <w:tcPr>
-            <w:tcW w:w="2925" w:type="dxa"/>
+            <w:tcW w:w="2689" w:type="dxa"/>
             <w:tcBorders>
               <w:top w:val="single" w:sz="4" w:space="0" w:color="BFC7D1"/>
               <w:left w:val="single" w:sz="4" w:space="0" w:color="BFC7D1"/>
@@ -6305,7 +6305,7 @@
         </w:tc>
         <w:tc>
           <w:tcPr>
-            <w:tcW w:w="2923" w:type="dxa"/>
+            <w:tcW w:w="2674" w:type="dxa"/>
             <w:tcBorders>
               <w:top w:val="single" w:sz="4" w:space="0" w:color="BFC7D1"/>
               <w:left w:val="single" w:sz="4" w:space="0" w:color="BFC7D1"/>
@@ -6384,7 +6384,7 @@
         </w:tc>
         <w:tc>
           <w:tcPr>
-            <w:tcW w:w="2260" w:type="dxa"/>
+            <w:tcW w:w="2745" w:type="dxa"/>
             <w:tcBorders>
               <w:top w:val="single" w:sz="4" w:space="0" w:color="BFC7D1"/>
               <w:left w:val="single" w:sz="4" w:space="0" w:color="BFC7D1"/>
@@ -6421,7 +6421,7 @@
         </w:tc>
         <w:tc>
           <w:tcPr>
-            <w:tcW w:w="2925" w:type="dxa"/>
+            <w:tcW w:w="2689" w:type="dxa"/>
             <w:tcBorders>
               <w:top w:val="single" w:sz="4" w:space="0" w:color="BFC7D1"/>
               <w:left w:val="single" w:sz="4" w:space="0" w:color="BFC7D1"/>
@@ -6458,7 +6458,7 @@
         </w:tc>
         <w:tc>
           <w:tcPr>
-            <w:tcW w:w="2923" w:type="dxa"/>
+            <w:tcW w:w="2674" w:type="dxa"/>
             <w:tcBorders>
               <w:top w:val="single" w:sz="4" w:space="0" w:color="BFC7D1"/>
               <w:left w:val="single" w:sz="4" w:space="0" w:color="BFC7D1"/>
@@ -6535,7 +6535,7 @@
         </w:tc>
         <w:tc>
           <w:tcPr>
-            <w:tcW w:w="2260" w:type="dxa"/>
+            <w:tcW w:w="2745" w:type="dxa"/>
             <w:tcBorders>
               <w:top w:val="single" w:sz="4" w:space="0" w:color="BFC7D1"/>
               <w:left w:val="single" w:sz="4" w:space="0" w:color="BFC7D1"/>
@@ -6572,7 +6572,7 @@
         </w:tc>
         <w:tc>
           <w:tcPr>
-            <w:tcW w:w="2925" w:type="dxa"/>
+            <w:tcW w:w="2689" w:type="dxa"/>
             <w:tcBorders>
               <w:top w:val="single" w:sz="4" w:space="0" w:color="BFC7D1"/>
               <w:left w:val="single" w:sz="4" w:space="0" w:color="BFC7D1"/>
@@ -6620,7 +6620,7 @@
         </w:tc>
         <w:tc>
           <w:tcPr>
-            <w:tcW w:w="2923" w:type="dxa"/>
+            <w:tcW w:w="2674" w:type="dxa"/>
             <w:tcBorders>
               <w:top w:val="single" w:sz="4" w:space="0" w:color="BFC7D1"/>
               <w:left w:val="single" w:sz="4" w:space="0" w:color="BFC7D1"/>
@@ -6697,7 +6697,7 @@
         </w:tc>
         <w:tc>
           <w:tcPr>
-            <w:tcW w:w="2260" w:type="dxa"/>
+            <w:tcW w:w="2745" w:type="dxa"/>
             <w:tcBorders>
               <w:top w:val="single" w:sz="4" w:space="0" w:color="BFC7D1"/>
               <w:left w:val="single" w:sz="4" w:space="0" w:color="BFC7D1"/>
@@ -6734,7 +6734,7 @@
         </w:tc>
         <w:tc>
           <w:tcPr>
-            <w:tcW w:w="2925" w:type="dxa"/>
+            <w:tcW w:w="2689" w:type="dxa"/>
             <w:tcBorders>
               <w:top w:val="single" w:sz="4" w:space="0" w:color="BFC7D1"/>
               <w:left w:val="single" w:sz="4" w:space="0" w:color="BFC7D1"/>
@@ -6771,7 +6771,7 @@
         </w:tc>
         <w:tc>
           <w:tcPr>
-            <w:tcW w:w="2923" w:type="dxa"/>
+            <w:tcW w:w="2674" w:type="dxa"/>
             <w:tcBorders>
               <w:top w:val="single" w:sz="4" w:space="0" w:color="BFC7D1"/>
               <w:left w:val="single" w:sz="4" w:space="0" w:color="BFC7D1"/>
@@ -6848,7 +6848,7 @@
         </w:tc>
         <w:tc>
           <w:tcPr>
-            <w:tcW w:w="2260" w:type="dxa"/>
+            <w:tcW w:w="2745" w:type="dxa"/>
             <w:tcBorders>
               <w:top w:val="single" w:sz="4" w:space="0" w:color="BFC7D1"/>
               <w:left w:val="single" w:sz="4" w:space="0" w:color="BFC7D1"/>
@@ -6885,7 +6885,7 @@
         </w:tc>
         <w:tc>
           <w:tcPr>
-            <w:tcW w:w="2925" w:type="dxa"/>
+            <w:tcW w:w="2689" w:type="dxa"/>
             <w:tcBorders>
               <w:top w:val="single" w:sz="4" w:space="0" w:color="BFC7D1"/>
               <w:left w:val="single" w:sz="4" w:space="0" w:color="BFC7D1"/>
@@ -6922,7 +6922,7 @@
         </w:tc>
         <w:tc>
           <w:tcPr>
-            <w:tcW w:w="2923" w:type="dxa"/>
+            <w:tcW w:w="2674" w:type="dxa"/>
             <w:tcBorders>
               <w:top w:val="single" w:sz="4" w:space="0" w:color="BFC7D1"/>
               <w:left w:val="single" w:sz="4" w:space="0" w:color="BFC7D1"/>
@@ -6999,7 +6999,7 @@
         </w:tc>
         <w:tc>
           <w:tcPr>
-            <w:tcW w:w="2260" w:type="dxa"/>
+            <w:tcW w:w="2745" w:type="dxa"/>
             <w:tcBorders>
               <w:top w:val="single" w:sz="4" w:space="0" w:color="BFC7D1"/>
               <w:left w:val="single" w:sz="4" w:space="0" w:color="BFC7D1"/>
@@ -7069,7 +7069,7 @@
         </w:tc>
         <w:tc>
           <w:tcPr>
-            <w:tcW w:w="2925" w:type="dxa"/>
+            <w:tcW w:w="2689" w:type="dxa"/>
             <w:tcBorders>
               <w:top w:val="single" w:sz="4" w:space="0" w:color="BFC7D1"/>
               <w:left w:val="single" w:sz="4" w:space="0" w:color="BFC7D1"/>
@@ -7106,7 +7106,7 @@
         </w:tc>
         <w:tc>
           <w:tcPr>
-            <w:tcW w:w="2923" w:type="dxa"/>
+            <w:tcW w:w="2674" w:type="dxa"/>
             <w:tcBorders>
               <w:top w:val="single" w:sz="4" w:space="0" w:color="BFC7D1"/>
               <w:left w:val="single" w:sz="4" w:space="0" w:color="BFC7D1"/>
@@ -7176,7 +7176,7 @@
         <w:pStyle w:val="Heading1"/>
         <w:rPr/>
       </w:pPr>
-      <w:bookmarkStart w:id="13" w:name="__RefHeading___Toc3892_1957936413"/>
+      <w:bookmarkStart w:id="13" w:name="__RefHeading___Toc11698_4195859891"/>
       <w:bookmarkEnd w:id="13"/>
       <w:r>
         <w:rPr>
@@ -7193,7 +7193,7 @@
         <w:pStyle w:val="Heading2"/>
         <w:rPr/>
       </w:pPr>
-      <w:bookmarkStart w:id="14" w:name="__RefHeading___Toc3894_1957936413"/>
+      <w:bookmarkStart w:id="14" w:name="__RefHeading___Toc11700_4195859891"/>
       <w:bookmarkEnd w:id="14"/>
       <w:r>
         <w:rPr>
@@ -8290,7 +8290,7 @@
         <w:pStyle w:val="Heading2"/>
         <w:rPr/>
       </w:pPr>
-      <w:bookmarkStart w:id="15" w:name="__RefHeading___Toc3896_1957936413"/>
+      <w:bookmarkStart w:id="15" w:name="__RefHeading___Toc11702_4195859891"/>
       <w:bookmarkEnd w:id="15"/>
       <w:r>
         <w:rPr>
@@ -9579,7 +9579,7 @@
         <w:pStyle w:val="Heading2"/>
         <w:rPr/>
       </w:pPr>
-      <w:bookmarkStart w:id="16" w:name="__RefHeading___Toc3898_1957936413"/>
+      <w:bookmarkStart w:id="16" w:name="__RefHeading___Toc11704_4195859891"/>
       <w:bookmarkEnd w:id="16"/>
       <w:r>
         <w:rPr>
@@ -9614,7 +9614,7 @@
         <w:pStyle w:val="Heading1"/>
         <w:rPr/>
       </w:pPr>
-      <w:bookmarkStart w:id="17" w:name="__RefHeading___Toc3900_1957936413"/>
+      <w:bookmarkStart w:id="17" w:name="__RefHeading___Toc11706_4195859891"/>
       <w:bookmarkEnd w:id="17"/>
       <w:r>
         <w:rPr>
@@ -9631,7 +9631,7 @@
         <w:pStyle w:val="Heading2"/>
         <w:rPr/>
       </w:pPr>
-      <w:bookmarkStart w:id="18" w:name="__RefHeading___Toc3902_1957936413"/>
+      <w:bookmarkStart w:id="18" w:name="__RefHeading___Toc11708_4195859891"/>
       <w:bookmarkEnd w:id="18"/>
       <w:r>
         <w:rPr>
@@ -11280,7 +11280,7 @@
         <w:pStyle w:val="Heading2"/>
         <w:rPr/>
       </w:pPr>
-      <w:bookmarkStart w:id="19" w:name="__RefHeading___Toc3904_1957936413"/>
+      <w:bookmarkStart w:id="19" w:name="__RefHeading___Toc11710_4195859891"/>
       <w:bookmarkEnd w:id="19"/>
       <w:r>
         <w:rPr>
@@ -11346,7 +11346,7 @@
         <w:pStyle w:val="Heading1"/>
         <w:rPr/>
       </w:pPr>
-      <w:bookmarkStart w:id="20" w:name="__RefHeading___Toc3906_1957936413"/>
+      <w:bookmarkStart w:id="20" w:name="__RefHeading___Toc11712_4195859891"/>
       <w:bookmarkEnd w:id="20"/>
       <w:r>
         <w:rPr>
@@ -11378,7 +11378,7 @@
         <w:pStyle w:val="Heading2"/>
         <w:rPr/>
       </w:pPr>
-      <w:bookmarkStart w:id="21" w:name="__RefHeading___Toc3908_1957936413"/>
+      <w:bookmarkStart w:id="21" w:name="__RefHeading___Toc11714_4195859891"/>
       <w:bookmarkEnd w:id="21"/>
       <w:r>
         <w:rPr>
@@ -11649,7 +11649,7 @@
         <w:pStyle w:val="Heading2"/>
         <w:rPr/>
       </w:pPr>
-      <w:bookmarkStart w:id="22" w:name="__RefHeading___Toc3910_1957936413"/>
+      <w:bookmarkStart w:id="22" w:name="__RefHeading___Toc11716_4195859891"/>
       <w:bookmarkEnd w:id="22"/>
       <w:r>
         <w:rPr>
@@ -12344,7 +12344,7 @@
         <w:pStyle w:val="Heading2"/>
         <w:rPr/>
       </w:pPr>
-      <w:bookmarkStart w:id="23" w:name="__RefHeading___Toc3912_1957936413"/>
+      <w:bookmarkStart w:id="23" w:name="__RefHeading___Toc11718_4195859891"/>
       <w:bookmarkEnd w:id="23"/>
       <w:r>
         <w:rPr>
@@ -12449,7 +12449,7 @@
         <w:pStyle w:val="Heading2"/>
         <w:rPr/>
       </w:pPr>
-      <w:bookmarkStart w:id="24" w:name="__RefHeading___Toc3914_1957936413"/>
+      <w:bookmarkStart w:id="24" w:name="__RefHeading___Toc11720_4195859891"/>
       <w:bookmarkEnd w:id="24"/>
       <w:r>
         <w:rPr>
@@ -12554,7 +12554,7 @@
         <w:pStyle w:val="Heading2"/>
         <w:rPr/>
       </w:pPr>
-      <w:bookmarkStart w:id="25" w:name="__RefHeading___Toc3916_1957936413"/>
+      <w:bookmarkStart w:id="25" w:name="__RefHeading___Toc11722_4195859891"/>
       <w:bookmarkEnd w:id="25"/>
       <w:r>
         <w:rPr>
@@ -12625,7 +12625,7 @@
         <w:pStyle w:val="Heading2"/>
         <w:rPr/>
       </w:pPr>
-      <w:bookmarkStart w:id="26" w:name="__RefHeading___Toc3918_1957936413"/>
+      <w:bookmarkStart w:id="26" w:name="__RefHeading___Toc11724_4195859891"/>
       <w:bookmarkEnd w:id="26"/>
       <w:r>
         <w:rPr>
@@ -12769,7 +12769,7 @@
         <w:pStyle w:val="Heading2"/>
         <w:rPr/>
       </w:pPr>
-      <w:bookmarkStart w:id="27" w:name="__RefHeading___Toc3920_1957936413"/>
+      <w:bookmarkStart w:id="27" w:name="__RefHeading___Toc11726_4195859891"/>
       <w:bookmarkEnd w:id="27"/>
       <w:r>
         <w:rPr>
@@ -12824,7 +12824,7 @@
         <w:pStyle w:val="Heading2"/>
         <w:rPr/>
       </w:pPr>
-      <w:bookmarkStart w:id="28" w:name="__RefHeading___Toc3922_1957936413"/>
+      <w:bookmarkStart w:id="28" w:name="__RefHeading___Toc11728_4195859891"/>
       <w:bookmarkEnd w:id="28"/>
       <w:r>
         <w:rPr>
@@ -12859,7 +12859,7 @@
         <w:pStyle w:val="Heading1"/>
         <w:rPr/>
       </w:pPr>
-      <w:bookmarkStart w:id="29" w:name="__RefHeading___Toc3924_1957936413"/>
+      <w:bookmarkStart w:id="29" w:name="__RefHeading___Toc11730_4195859891"/>
       <w:bookmarkEnd w:id="29"/>
       <w:r>
         <w:rPr>
@@ -12876,7 +12876,7 @@
         <w:pStyle w:val="Heading2"/>
         <w:rPr/>
       </w:pPr>
-      <w:bookmarkStart w:id="30" w:name="__RefHeading___Toc3926_1957936413"/>
+      <w:bookmarkStart w:id="30" w:name="__RefHeading___Toc11732_4195859891"/>
       <w:bookmarkEnd w:id="30"/>
       <w:r>
         <w:rPr>
@@ -13468,7 +13468,7 @@
         <w:pStyle w:val="Heading2"/>
         <w:rPr/>
       </w:pPr>
-      <w:bookmarkStart w:id="31" w:name="__RefHeading___Toc3928_1957936413"/>
+      <w:bookmarkStart w:id="31" w:name="__RefHeading___Toc11734_4195859891"/>
       <w:bookmarkEnd w:id="31"/>
       <w:r>
         <w:rPr>
@@ -13928,7 +13928,7 @@
         <w:pStyle w:val="Heading2"/>
         <w:rPr/>
       </w:pPr>
-      <w:bookmarkStart w:id="32" w:name="__RefHeading___Toc3930_1957936413"/>
+      <w:bookmarkStart w:id="32" w:name="__RefHeading___Toc11736_4195859891"/>
       <w:bookmarkEnd w:id="32"/>
       <w:r>
         <w:rPr>
@@ -14689,7 +14689,7 @@
         <w:pStyle w:val="Heading2"/>
         <w:rPr/>
       </w:pPr>
-      <w:bookmarkStart w:id="33" w:name="__RefHeading___Toc3932_1957936413"/>
+      <w:bookmarkStart w:id="33" w:name="__RefHeading___Toc11738_4195859891"/>
       <w:bookmarkEnd w:id="33"/>
       <w:r>
         <w:rPr>
@@ -15226,7 +15226,7 @@
         <w:pStyle w:val="Heading2"/>
         <w:rPr/>
       </w:pPr>
-      <w:bookmarkStart w:id="34" w:name="__RefHeading___Toc3934_1957936413"/>
+      <w:bookmarkStart w:id="34" w:name="__RefHeading___Toc11740_4195859891"/>
       <w:bookmarkEnd w:id="34"/>
       <w:r>
         <w:rPr>
@@ -15664,7 +15664,7 @@
         <w:pStyle w:val="Heading2"/>
         <w:rPr/>
       </w:pPr>
-      <w:bookmarkStart w:id="35" w:name="__RefHeading___Toc3936_1957936413"/>
+      <w:bookmarkStart w:id="35" w:name="__RefHeading___Toc11742_4195859891"/>
       <w:bookmarkEnd w:id="35"/>
       <w:r>
         <w:rPr>
@@ -15679,7 +15679,7 @@
     <w:tbl>
       <w:tblPr>
         <w:tblStyle w:val="TableGrid"/>
-        <w:tblW w:w="9015" w:type="dxa"/>
+        <w:tblW w:w="9014" w:type="dxa"/>
         <w:jc w:val="left"/>
         <w:tblInd w:w="0" w:type="dxa"/>
         <w:tblLayout w:type="fixed"/>
@@ -15693,8 +15693,8 @@
       </w:tblPr>
       <w:tblGrid>
         <w:gridCol w:w="1361"/>
-        <w:gridCol w:w="3755"/>
-        <w:gridCol w:w="3899"/>
+        <w:gridCol w:w="3825"/>
+        <w:gridCol w:w="3828"/>
       </w:tblGrid>
       <w:tr>
         <w:trPr>
@@ -15741,7 +15741,7 @@
         </w:tc>
         <w:tc>
           <w:tcPr>
-            <w:tcW w:w="3755" w:type="dxa"/>
+            <w:tcW w:w="3825" w:type="dxa"/>
             <w:tcBorders>
               <w:top w:val="single" w:sz="4" w:space="0" w:color="BFC7D1"/>
               <w:left w:val="single" w:sz="4" w:space="0" w:color="BFC7D1"/>
@@ -15780,7 +15780,7 @@
         </w:tc>
         <w:tc>
           <w:tcPr>
-            <w:tcW w:w="3899" w:type="dxa"/>
+            <w:tcW w:w="3828" w:type="dxa"/>
             <w:tcBorders>
               <w:top w:val="single" w:sz="4" w:space="0" w:color="BFC7D1"/>
               <w:left w:val="single" w:sz="4" w:space="0" w:color="BFC7D1"/>
@@ -15859,7 +15859,7 @@
         </w:tc>
         <w:tc>
           <w:tcPr>
-            <w:tcW w:w="3755" w:type="dxa"/>
+            <w:tcW w:w="3825" w:type="dxa"/>
             <w:tcBorders>
               <w:top w:val="single" w:sz="4" w:space="0" w:color="BFC7D1"/>
               <w:left w:val="single" w:sz="4" w:space="0" w:color="BFC7D1"/>
@@ -15896,7 +15896,7 @@
         </w:tc>
         <w:tc>
           <w:tcPr>
-            <w:tcW w:w="3899" w:type="dxa"/>
+            <w:tcW w:w="3828" w:type="dxa"/>
             <w:tcBorders>
               <w:top w:val="single" w:sz="4" w:space="0" w:color="BFC7D1"/>
               <w:left w:val="single" w:sz="4" w:space="0" w:color="BFC7D1"/>
@@ -15973,7 +15973,7 @@
         </w:tc>
         <w:tc>
           <w:tcPr>
-            <w:tcW w:w="3755" w:type="dxa"/>
+            <w:tcW w:w="3825" w:type="dxa"/>
             <w:tcBorders>
               <w:top w:val="single" w:sz="4" w:space="0" w:color="BFC7D1"/>
               <w:left w:val="single" w:sz="4" w:space="0" w:color="BFC7D1"/>
@@ -16010,7 +16010,7 @@
         </w:tc>
         <w:tc>
           <w:tcPr>
-            <w:tcW w:w="3899" w:type="dxa"/>
+            <w:tcW w:w="3828" w:type="dxa"/>
             <w:tcBorders>
               <w:top w:val="single" w:sz="4" w:space="0" w:color="BFC7D1"/>
               <w:left w:val="single" w:sz="4" w:space="0" w:color="BFC7D1"/>
@@ -16087,7 +16087,7 @@
         </w:tc>
         <w:tc>
           <w:tcPr>
-            <w:tcW w:w="3755" w:type="dxa"/>
+            <w:tcW w:w="3825" w:type="dxa"/>
             <w:tcBorders>
               <w:top w:val="single" w:sz="4" w:space="0" w:color="BFC7D1"/>
               <w:left w:val="single" w:sz="4" w:space="0" w:color="BFC7D1"/>
@@ -16124,7 +16124,7 @@
         </w:tc>
         <w:tc>
           <w:tcPr>
-            <w:tcW w:w="3899" w:type="dxa"/>
+            <w:tcW w:w="3828" w:type="dxa"/>
             <w:tcBorders>
               <w:top w:val="single" w:sz="4" w:space="0" w:color="BFC7D1"/>
               <w:left w:val="single" w:sz="4" w:space="0" w:color="BFC7D1"/>
@@ -16201,7 +16201,7 @@
         </w:tc>
         <w:tc>
           <w:tcPr>
-            <w:tcW w:w="3755" w:type="dxa"/>
+            <w:tcW w:w="3825" w:type="dxa"/>
             <w:tcBorders>
               <w:top w:val="single" w:sz="4" w:space="0" w:color="BFC7D1"/>
               <w:left w:val="single" w:sz="4" w:space="0" w:color="BFC7D1"/>
@@ -16238,7 +16238,7 @@
         </w:tc>
         <w:tc>
           <w:tcPr>
-            <w:tcW w:w="3899" w:type="dxa"/>
+            <w:tcW w:w="3828" w:type="dxa"/>
             <w:tcBorders>
               <w:top w:val="single" w:sz="4" w:space="0" w:color="BFC7D1"/>
               <w:left w:val="single" w:sz="4" w:space="0" w:color="BFC7D1"/>
@@ -16293,7 +16293,7 @@
         <w:pStyle w:val="Heading1"/>
         <w:rPr/>
       </w:pPr>
-      <w:bookmarkStart w:id="36" w:name="__RefHeading___Toc3938_1957936413"/>
+      <w:bookmarkStart w:id="36" w:name="__RefHeading___Toc11744_4195859891"/>
       <w:bookmarkEnd w:id="36"/>
       <w:r>
         <w:rPr>
@@ -17062,7 +17062,7 @@
         <w:pStyle w:val="Heading1"/>
         <w:rPr/>
       </w:pPr>
-      <w:bookmarkStart w:id="37" w:name="__RefHeading___Toc3940_1957936413"/>
+      <w:bookmarkStart w:id="37" w:name="__RefHeading___Toc11746_4195859891"/>
       <w:bookmarkEnd w:id="37"/>
       <w:r>
         <w:rPr>
@@ -18147,7 +18147,7 @@
         <w:pStyle w:val="Heading1"/>
         <w:rPr/>
       </w:pPr>
-      <w:bookmarkStart w:id="38" w:name="__RefHeading___Toc3942_1957936413"/>
+      <w:bookmarkStart w:id="38" w:name="__RefHeading___Toc11748_4195859891"/>
       <w:bookmarkEnd w:id="38"/>
       <w:r>
         <w:rPr>
@@ -20984,7 +20984,7 @@
         <w:pStyle w:val="Heading1"/>
         <w:rPr/>
       </w:pPr>
-      <w:bookmarkStart w:id="39" w:name="__RefHeading___Toc3944_1957936413"/>
+      <w:bookmarkStart w:id="39" w:name="__RefHeading___Toc11750_4195859891"/>
       <w:bookmarkEnd w:id="39"/>
       <w:r>
         <w:rPr>
@@ -21001,7 +21001,7 @@
         <w:pStyle w:val="Heading2"/>
         <w:rPr/>
       </w:pPr>
-      <w:bookmarkStart w:id="40" w:name="__RefHeading___Toc3946_1957936413"/>
+      <w:bookmarkStart w:id="40" w:name="__RefHeading___Toc11752_4195859891"/>
       <w:bookmarkEnd w:id="40"/>
       <w:r>
         <w:rPr>
@@ -21995,7 +21995,7 @@
         <w:pStyle w:val="Heading2"/>
         <w:rPr/>
       </w:pPr>
-      <w:bookmarkStart w:id="41" w:name="__RefHeading___Toc3948_1957936413"/>
+      <w:bookmarkStart w:id="41" w:name="__RefHeading___Toc11754_4195859891"/>
       <w:bookmarkEnd w:id="41"/>
       <w:r>
         <w:rPr>
@@ -22023,10 +22023,10 @@
         <w:tblLook w:val="04a0" w:noHBand="0" w:noVBand="1" w:firstColumn="1" w:lastRow="0" w:lastColumn="0" w:firstRow="1"/>
       </w:tblPr>
       <w:tblGrid>
-        <w:gridCol w:w="1457"/>
-        <w:gridCol w:w="3181"/>
-        <w:gridCol w:w="2984"/>
-        <w:gridCol w:w="1391"/>
+        <w:gridCol w:w="1455"/>
+        <w:gridCol w:w="3169"/>
+        <w:gridCol w:w="2966"/>
+        <w:gridCol w:w="1423"/>
       </w:tblGrid>
       <w:tr>
         <w:trPr>
@@ -22034,7 +22034,7 @@
         </w:trPr>
         <w:tc>
           <w:tcPr>
-            <w:tcW w:w="1457" w:type="dxa"/>
+            <w:tcW w:w="1455" w:type="dxa"/>
             <w:tcBorders>
               <w:top w:val="single" w:sz="4" w:space="0" w:color="BFC7D1"/>
               <w:left w:val="single" w:sz="4" w:space="0" w:color="BFC7D1"/>
@@ -22073,7 +22073,7 @@
         </w:tc>
         <w:tc>
           <w:tcPr>
-            <w:tcW w:w="3181" w:type="dxa"/>
+            <w:tcW w:w="3169" w:type="dxa"/>
             <w:tcBorders>
               <w:top w:val="single" w:sz="4" w:space="0" w:color="BFC7D1"/>
               <w:left w:val="single" w:sz="4" w:space="0" w:color="BFC7D1"/>
@@ -22112,7 +22112,7 @@
         </w:tc>
         <w:tc>
           <w:tcPr>
-            <w:tcW w:w="2984" w:type="dxa"/>
+            <w:tcW w:w="2966" w:type="dxa"/>
             <w:tcBorders>
               <w:top w:val="single" w:sz="4" w:space="0" w:color="BFC7D1"/>
               <w:left w:val="single" w:sz="4" w:space="0" w:color="BFC7D1"/>
@@ -22151,7 +22151,7 @@
         </w:tc>
         <w:tc>
           <w:tcPr>
-            <w:tcW w:w="1391" w:type="dxa"/>
+            <w:tcW w:w="1423" w:type="dxa"/>
             <w:tcBorders>
               <w:top w:val="single" w:sz="4" w:space="0" w:color="BFC7D1"/>
               <w:left w:val="single" w:sz="4" w:space="0" w:color="BFC7D1"/>
@@ -22193,7 +22193,7 @@
         <w:trPr/>
         <w:tc>
           <w:tcPr>
-            <w:tcW w:w="1457" w:type="dxa"/>
+            <w:tcW w:w="1455" w:type="dxa"/>
             <w:tcBorders>
               <w:top w:val="single" w:sz="4" w:space="0" w:color="BFC7D1"/>
               <w:left w:val="single" w:sz="4" w:space="0" w:color="BFC7D1"/>
@@ -22230,7 +22230,7 @@
         </w:tc>
         <w:tc>
           <w:tcPr>
-            <w:tcW w:w="3181" w:type="dxa"/>
+            <w:tcW w:w="3169" w:type="dxa"/>
             <w:tcBorders>
               <w:top w:val="single" w:sz="4" w:space="0" w:color="BFC7D1"/>
               <w:left w:val="single" w:sz="4" w:space="0" w:color="BFC7D1"/>
@@ -22267,7 +22267,7 @@
         </w:tc>
         <w:tc>
           <w:tcPr>
-            <w:tcW w:w="2984" w:type="dxa"/>
+            <w:tcW w:w="2966" w:type="dxa"/>
             <w:tcBorders>
               <w:top w:val="single" w:sz="4" w:space="0" w:color="BFC7D1"/>
               <w:left w:val="single" w:sz="4" w:space="0" w:color="BFC7D1"/>
@@ -22304,7 +22304,7 @@
         </w:tc>
         <w:tc>
           <w:tcPr>
-            <w:tcW w:w="1391" w:type="dxa"/>
+            <w:tcW w:w="1423" w:type="dxa"/>
             <w:tcBorders>
               <w:top w:val="single" w:sz="4" w:space="0" w:color="BFC7D1"/>
               <w:left w:val="single" w:sz="4" w:space="0" w:color="BFC7D1"/>
@@ -22344,7 +22344,7 @@
         <w:trPr/>
         <w:tc>
           <w:tcPr>
-            <w:tcW w:w="1457" w:type="dxa"/>
+            <w:tcW w:w="1455" w:type="dxa"/>
             <w:tcBorders>
               <w:top w:val="single" w:sz="4" w:space="0" w:color="BFC7D1"/>
               <w:left w:val="single" w:sz="4" w:space="0" w:color="BFC7D1"/>
@@ -22381,7 +22381,7 @@
         </w:tc>
         <w:tc>
           <w:tcPr>
-            <w:tcW w:w="3181" w:type="dxa"/>
+            <w:tcW w:w="3169" w:type="dxa"/>
             <w:tcBorders>
               <w:top w:val="single" w:sz="4" w:space="0" w:color="BFC7D1"/>
               <w:left w:val="single" w:sz="4" w:space="0" w:color="BFC7D1"/>
@@ -22418,7 +22418,7 @@
         </w:tc>
         <w:tc>
           <w:tcPr>
-            <w:tcW w:w="2984" w:type="dxa"/>
+            <w:tcW w:w="2966" w:type="dxa"/>
             <w:tcBorders>
               <w:top w:val="single" w:sz="4" w:space="0" w:color="BFC7D1"/>
               <w:left w:val="single" w:sz="4" w:space="0" w:color="BFC7D1"/>
@@ -22455,7 +22455,7 @@
         </w:tc>
         <w:tc>
           <w:tcPr>
-            <w:tcW w:w="1391" w:type="dxa"/>
+            <w:tcW w:w="1423" w:type="dxa"/>
             <w:tcBorders>
               <w:top w:val="single" w:sz="4" w:space="0" w:color="BFC7D1"/>
               <w:left w:val="single" w:sz="4" w:space="0" w:color="BFC7D1"/>
@@ -22495,7 +22495,7 @@
         <w:trPr/>
         <w:tc>
           <w:tcPr>
-            <w:tcW w:w="1457" w:type="dxa"/>
+            <w:tcW w:w="1455" w:type="dxa"/>
             <w:tcBorders>
               <w:top w:val="single" w:sz="4" w:space="0" w:color="BFC7D1"/>
               <w:left w:val="single" w:sz="4" w:space="0" w:color="BFC7D1"/>
@@ -22532,7 +22532,7 @@
         </w:tc>
         <w:tc>
           <w:tcPr>
-            <w:tcW w:w="3181" w:type="dxa"/>
+            <w:tcW w:w="3169" w:type="dxa"/>
             <w:tcBorders>
               <w:top w:val="single" w:sz="4" w:space="0" w:color="BFC7D1"/>
               <w:left w:val="single" w:sz="4" w:space="0" w:color="BFC7D1"/>
@@ -22569,7 +22569,7 @@
         </w:tc>
         <w:tc>
           <w:tcPr>
-            <w:tcW w:w="2984" w:type="dxa"/>
+            <w:tcW w:w="2966" w:type="dxa"/>
             <w:tcBorders>
               <w:top w:val="single" w:sz="4" w:space="0" w:color="BFC7D1"/>
               <w:left w:val="single" w:sz="4" w:space="0" w:color="BFC7D1"/>
@@ -22606,7 +22606,7 @@
         </w:tc>
         <w:tc>
           <w:tcPr>
-            <w:tcW w:w="1391" w:type="dxa"/>
+            <w:tcW w:w="1423" w:type="dxa"/>
             <w:tcBorders>
               <w:top w:val="single" w:sz="4" w:space="0" w:color="BFC7D1"/>
               <w:left w:val="single" w:sz="4" w:space="0" w:color="BFC7D1"/>
@@ -22646,7 +22646,7 @@
         <w:trPr/>
         <w:tc>
           <w:tcPr>
-            <w:tcW w:w="1457" w:type="dxa"/>
+            <w:tcW w:w="1455" w:type="dxa"/>
             <w:tcBorders>
               <w:top w:val="single" w:sz="4" w:space="0" w:color="BFC7D1"/>
               <w:left w:val="single" w:sz="4" w:space="0" w:color="BFC7D1"/>
@@ -22683,7 +22683,7 @@
         </w:tc>
         <w:tc>
           <w:tcPr>
-            <w:tcW w:w="3181" w:type="dxa"/>
+            <w:tcW w:w="3169" w:type="dxa"/>
             <w:tcBorders>
               <w:top w:val="single" w:sz="4" w:space="0" w:color="BFC7D1"/>
               <w:left w:val="single" w:sz="4" w:space="0" w:color="BFC7D1"/>
@@ -22720,7 +22720,7 @@
         </w:tc>
         <w:tc>
           <w:tcPr>
-            <w:tcW w:w="2984" w:type="dxa"/>
+            <w:tcW w:w="2966" w:type="dxa"/>
             <w:tcBorders>
               <w:top w:val="single" w:sz="4" w:space="0" w:color="BFC7D1"/>
               <w:left w:val="single" w:sz="4" w:space="0" w:color="BFC7D1"/>
@@ -22757,7 +22757,7 @@
         </w:tc>
         <w:tc>
           <w:tcPr>
-            <w:tcW w:w="1391" w:type="dxa"/>
+            <w:tcW w:w="1423" w:type="dxa"/>
             <w:tcBorders>
               <w:top w:val="single" w:sz="4" w:space="0" w:color="BFC7D1"/>
               <w:left w:val="single" w:sz="4" w:space="0" w:color="BFC7D1"/>
@@ -22797,7 +22797,7 @@
         <w:trPr/>
         <w:tc>
           <w:tcPr>
-            <w:tcW w:w="1457" w:type="dxa"/>
+            <w:tcW w:w="1455" w:type="dxa"/>
             <w:tcBorders>
               <w:top w:val="single" w:sz="4" w:space="0" w:color="BFC7D1"/>
               <w:left w:val="single" w:sz="4" w:space="0" w:color="BFC7D1"/>
@@ -22834,7 +22834,7 @@
         </w:tc>
         <w:tc>
           <w:tcPr>
-            <w:tcW w:w="3181" w:type="dxa"/>
+            <w:tcW w:w="3169" w:type="dxa"/>
             <w:tcBorders>
               <w:top w:val="single" w:sz="4" w:space="0" w:color="BFC7D1"/>
               <w:left w:val="single" w:sz="4" w:space="0" w:color="BFC7D1"/>
@@ -22871,7 +22871,7 @@
         </w:tc>
         <w:tc>
           <w:tcPr>
-            <w:tcW w:w="2984" w:type="dxa"/>
+            <w:tcW w:w="2966" w:type="dxa"/>
             <w:tcBorders>
               <w:top w:val="single" w:sz="4" w:space="0" w:color="BFC7D1"/>
               <w:left w:val="single" w:sz="4" w:space="0" w:color="BFC7D1"/>
@@ -22908,7 +22908,7 @@
         </w:tc>
         <w:tc>
           <w:tcPr>
-            <w:tcW w:w="1391" w:type="dxa"/>
+            <w:tcW w:w="1423" w:type="dxa"/>
             <w:tcBorders>
               <w:top w:val="single" w:sz="4" w:space="0" w:color="BFC7D1"/>
               <w:left w:val="single" w:sz="4" w:space="0" w:color="BFC7D1"/>
@@ -22978,7 +22978,7 @@
         <w:pStyle w:val="Heading1"/>
         <w:rPr/>
       </w:pPr>
-      <w:bookmarkStart w:id="42" w:name="__RefHeading___Toc3950_1957936413"/>
+      <w:bookmarkStart w:id="42" w:name="__RefHeading___Toc11756_4195859891"/>
       <w:bookmarkEnd w:id="42"/>
       <w:r>
         <w:rPr>
@@ -23069,7 +23069,7 @@
           <w:spacing w:val="0"/>
         </w:rPr>
       </w:pPr>
-      <w:bookmarkStart w:id="43" w:name="__RefHeading___Toc3952_1957936413"/>
+      <w:bookmarkStart w:id="43" w:name="__RefHeading___Toc11758_4195859891"/>
       <w:bookmarkStart w:id="44" w:name="_Toc233203395"/>
       <w:bookmarkEnd w:id="43"/>
       <w:r>
@@ -23440,7 +23440,7 @@
                 <w:szCs w:val="24"/>
                 <w:lang w:val="en-US" w:eastAsia="ja-JP" w:bidi="ar-SA"/>
               </w:rPr>
-              <w:t>Closed</w:t>
+              <w:t>Open</w:t>
             </w:r>
           </w:p>
         </w:tc>
@@ -24815,19 +24815,6 @@
       <w:r>
         <w:rPr/>
       </w:r>
-      <w:r>
-        <w:br w:type="page"/>
-      </w:r>
-    </w:p>
-    <w:p>
-      <w:pPr>
-        <w:pStyle w:val="Normal"/>
-        <w:spacing w:before="0" w:after="160"/>
-        <w:rPr/>
-      </w:pPr>
-      <w:r>
-        <w:rPr/>
-      </w:r>
     </w:p>
     <w:p>
       <w:pPr>
@@ -24841,7 +24828,7 @@
       <w:r>
         <w:rPr/>
         <w:drawing>
-          <wp:anchor behindDoc="1" distT="0" distB="0" distL="0" distR="0" simplePos="0" locked="0" layoutInCell="0" allowOverlap="1" relativeHeight="26">
+          <wp:anchor behindDoc="1" distT="0" distB="0" distL="0" distR="0" simplePos="0" locked="0" layoutInCell="0" allowOverlap="1" relativeHeight="24">
             <wp:simplePos x="0" y="0"/>
             <wp:positionH relativeFrom="margin">
               <wp:align>center</wp:align>
@@ -24912,7 +24899,7 @@
     <w:r>
       <w:rPr/>
       <w:drawing>
-        <wp:anchor behindDoc="1" distT="0" distB="0" distL="0" distR="0" simplePos="0" locked="0" layoutInCell="0" allowOverlap="1" relativeHeight="25">
+        <wp:anchor behindDoc="1" distT="0" distB="0" distL="0" distR="0" simplePos="0" locked="0" layoutInCell="0" allowOverlap="1" relativeHeight="23">
           <wp:simplePos x="0" y="0"/>
           <wp:positionH relativeFrom="page">
             <wp:align>left</wp:align>
@@ -24971,7 +24958,7 @@
     <w:r>
       <w:rPr/>
       <w:drawing>
-        <wp:anchor behindDoc="1" distT="0" distB="0" distL="0" distR="0" simplePos="0" locked="0" layoutInCell="0" allowOverlap="1" relativeHeight="25">
+        <wp:anchor behindDoc="1" distT="0" distB="0" distL="0" distR="0" simplePos="0" locked="0" layoutInCell="0" allowOverlap="1" relativeHeight="23">
           <wp:simplePos x="0" y="0"/>
           <wp:positionH relativeFrom="page">
             <wp:align>left</wp:align>

</xml_diff>

<commit_message>
Documentation quality pass: rebuilt documents (in progress)
</commit_message>
<xml_diff>
--- a/docs/package/out/BrokerVerse_Business_Continuity_and_Disaster_Recovery_Plan.docx
+++ b/docs/package/out/BrokerVerse_Business_Continuity_and_Disaster_Recovery_Plan.docx
@@ -789,7 +789,7 @@
             </w:rPr>
             <w:fldChar w:fldCharType="separate"/>
           </w:r>
-          <w:hyperlink w:anchor="__RefHeading___Toc11680_4195859891">
+          <w:hyperlink w:anchor="__RefHeading___Toc11680_3949650649">
             <w:r>
               <w:rPr>
                 <w:webHidden/>
@@ -824,7 +824,7 @@
             </w:tabs>
             <w:rPr/>
           </w:pPr>
-          <w:hyperlink w:anchor="__RefHeading___Toc11682_4195859891">
+          <w:hyperlink w:anchor="__RefHeading___Toc11682_3949650649">
             <w:r>
               <w:rPr>
                 <w:webHidden/>
@@ -853,7 +853,7 @@
             </w:tabs>
             <w:rPr/>
           </w:pPr>
-          <w:hyperlink w:anchor="__RefHeading___Toc11684_4195859891">
+          <w:hyperlink w:anchor="__RefHeading___Toc11684_3949650649">
             <w:r>
               <w:rPr>
                 <w:webHidden/>
@@ -875,7 +875,7 @@
             </w:tabs>
             <w:rPr/>
           </w:pPr>
-          <w:hyperlink w:anchor="__RefHeading___Toc11686_4195859891">
+          <w:hyperlink w:anchor="__RefHeading___Toc11686_3949650649">
             <w:r>
               <w:rPr>
                 <w:webHidden/>
@@ -897,7 +897,7 @@
             </w:tabs>
             <w:rPr/>
           </w:pPr>
-          <w:hyperlink w:anchor="__RefHeading___Toc11688_4195859891">
+          <w:hyperlink w:anchor="__RefHeading___Toc11688_3949650649">
             <w:r>
               <w:rPr>
                 <w:webHidden/>
@@ -919,7 +919,7 @@
             </w:tabs>
             <w:rPr/>
           </w:pPr>
-          <w:hyperlink w:anchor="__RefHeading___Toc11690_4195859891">
+          <w:hyperlink w:anchor="__RefHeading___Toc11690_3949650649">
             <w:r>
               <w:rPr>
                 <w:webHidden/>
@@ -941,7 +941,7 @@
             </w:tabs>
             <w:rPr/>
           </w:pPr>
-          <w:hyperlink w:anchor="__RefHeading___Toc11692_4195859891">
+          <w:hyperlink w:anchor="__RefHeading___Toc11692_3949650649">
             <w:r>
               <w:rPr>
                 <w:webHidden/>
@@ -963,7 +963,7 @@
             </w:tabs>
             <w:rPr/>
           </w:pPr>
-          <w:hyperlink w:anchor="__RefHeading___Toc11694_4195859891">
+          <w:hyperlink w:anchor="__RefHeading___Toc11694_3949650649">
             <w:r>
               <w:rPr>
                 <w:webHidden/>
@@ -985,7 +985,7 @@
             </w:tabs>
             <w:rPr/>
           </w:pPr>
-          <w:hyperlink w:anchor="__RefHeading___Toc11696_4195859891">
+          <w:hyperlink w:anchor="__RefHeading___Toc11696_3949650649">
             <w:r>
               <w:rPr>
                 <w:webHidden/>
@@ -1007,7 +1007,7 @@
             </w:tabs>
             <w:rPr/>
           </w:pPr>
-          <w:hyperlink w:anchor="__RefHeading___Toc11698_4195859891">
+          <w:hyperlink w:anchor="__RefHeading___Toc11698_3949650649">
             <w:r>
               <w:rPr>
                 <w:webHidden/>
@@ -1029,7 +1029,7 @@
             </w:tabs>
             <w:rPr/>
           </w:pPr>
-          <w:hyperlink w:anchor="__RefHeading___Toc11700_4195859891">
+          <w:hyperlink w:anchor="__RefHeading___Toc11700_3949650649">
             <w:r>
               <w:rPr>
                 <w:webHidden/>
@@ -1051,7 +1051,7 @@
             </w:tabs>
             <w:rPr/>
           </w:pPr>
-          <w:hyperlink w:anchor="__RefHeading___Toc11702_4195859891">
+          <w:hyperlink w:anchor="__RefHeading___Toc11702_3949650649">
             <w:r>
               <w:rPr>
                 <w:webHidden/>
@@ -1073,7 +1073,7 @@
             </w:tabs>
             <w:rPr/>
           </w:pPr>
-          <w:hyperlink w:anchor="__RefHeading___Toc11704_4195859891">
+          <w:hyperlink w:anchor="__RefHeading___Toc11704_3949650649">
             <w:r>
               <w:rPr>
                 <w:webHidden/>
@@ -1095,7 +1095,7 @@
             </w:tabs>
             <w:rPr/>
           </w:pPr>
-          <w:hyperlink w:anchor="__RefHeading___Toc11706_4195859891">
+          <w:hyperlink w:anchor="__RefHeading___Toc11706_3949650649">
             <w:r>
               <w:rPr>
                 <w:webHidden/>
@@ -1117,7 +1117,7 @@
             </w:tabs>
             <w:rPr/>
           </w:pPr>
-          <w:hyperlink w:anchor="__RefHeading___Toc11708_4195859891">
+          <w:hyperlink w:anchor="__RefHeading___Toc11708_3949650649">
             <w:r>
               <w:rPr>
                 <w:webHidden/>
@@ -1139,7 +1139,7 @@
             </w:tabs>
             <w:rPr/>
           </w:pPr>
-          <w:hyperlink w:anchor="__RefHeading___Toc11710_4195859891">
+          <w:hyperlink w:anchor="__RefHeading___Toc11710_3949650649">
             <w:r>
               <w:rPr>
                 <w:webHidden/>
@@ -1161,7 +1161,7 @@
             </w:tabs>
             <w:rPr/>
           </w:pPr>
-          <w:hyperlink w:anchor="__RefHeading___Toc11712_4195859891">
+          <w:hyperlink w:anchor="__RefHeading___Toc11712_3949650649">
             <w:r>
               <w:rPr>
                 <w:webHidden/>
@@ -1183,7 +1183,7 @@
             </w:tabs>
             <w:rPr/>
           </w:pPr>
-          <w:hyperlink w:anchor="__RefHeading___Toc11714_4195859891">
+          <w:hyperlink w:anchor="__RefHeading___Toc11714_3949650649">
             <w:r>
               <w:rPr>
                 <w:webHidden/>
@@ -1205,7 +1205,7 @@
             </w:tabs>
             <w:rPr/>
           </w:pPr>
-          <w:hyperlink w:anchor="__RefHeading___Toc11716_4195859891">
+          <w:hyperlink w:anchor="__RefHeading___Toc11716_3949650649">
             <w:r>
               <w:rPr>
                 <w:webHidden/>
@@ -1227,7 +1227,7 @@
             </w:tabs>
             <w:rPr/>
           </w:pPr>
-          <w:hyperlink w:anchor="__RefHeading___Toc11718_4195859891">
+          <w:hyperlink w:anchor="__RefHeading___Toc11718_3949650649">
             <w:r>
               <w:rPr>
                 <w:webHidden/>
@@ -1249,7 +1249,7 @@
             </w:tabs>
             <w:rPr/>
           </w:pPr>
-          <w:hyperlink w:anchor="__RefHeading___Toc11720_4195859891">
+          <w:hyperlink w:anchor="__RefHeading___Toc11720_3949650649">
             <w:r>
               <w:rPr>
                 <w:webHidden/>
@@ -1271,7 +1271,7 @@
             </w:tabs>
             <w:rPr/>
           </w:pPr>
-          <w:hyperlink w:anchor="__RefHeading___Toc11722_4195859891">
+          <w:hyperlink w:anchor="__RefHeading___Toc11722_3949650649">
             <w:r>
               <w:rPr>
                 <w:webHidden/>
@@ -1293,7 +1293,7 @@
             </w:tabs>
             <w:rPr/>
           </w:pPr>
-          <w:hyperlink w:anchor="__RefHeading___Toc11724_4195859891">
+          <w:hyperlink w:anchor="__RefHeading___Toc11724_3949650649">
             <w:r>
               <w:rPr>
                 <w:webHidden/>
@@ -1315,7 +1315,7 @@
             </w:tabs>
             <w:rPr/>
           </w:pPr>
-          <w:hyperlink w:anchor="__RefHeading___Toc11726_4195859891">
+          <w:hyperlink w:anchor="__RefHeading___Toc11726_3949650649">
             <w:r>
               <w:rPr>
                 <w:webHidden/>
@@ -1337,7 +1337,7 @@
             </w:tabs>
             <w:rPr/>
           </w:pPr>
-          <w:hyperlink w:anchor="__RefHeading___Toc11728_4195859891">
+          <w:hyperlink w:anchor="__RefHeading___Toc11728_3949650649">
             <w:r>
               <w:rPr>
                 <w:webHidden/>
@@ -1359,7 +1359,7 @@
             </w:tabs>
             <w:rPr/>
           </w:pPr>
-          <w:hyperlink w:anchor="__RefHeading___Toc11730_4195859891">
+          <w:hyperlink w:anchor="__RefHeading___Toc11730_3949650649">
             <w:r>
               <w:rPr>
                 <w:webHidden/>
@@ -1381,7 +1381,7 @@
             </w:tabs>
             <w:rPr/>
           </w:pPr>
-          <w:hyperlink w:anchor="__RefHeading___Toc11732_4195859891">
+          <w:hyperlink w:anchor="__RefHeading___Toc11732_3949650649">
             <w:r>
               <w:rPr>
                 <w:webHidden/>
@@ -1403,7 +1403,7 @@
             </w:tabs>
             <w:rPr/>
           </w:pPr>
-          <w:hyperlink w:anchor="__RefHeading___Toc11734_4195859891">
+          <w:hyperlink w:anchor="__RefHeading___Toc11734_3949650649">
             <w:r>
               <w:rPr>
                 <w:webHidden/>
@@ -1425,7 +1425,7 @@
             </w:tabs>
             <w:rPr/>
           </w:pPr>
-          <w:hyperlink w:anchor="__RefHeading___Toc11736_4195859891">
+          <w:hyperlink w:anchor="__RefHeading___Toc11736_3949650649">
             <w:r>
               <w:rPr>
                 <w:webHidden/>
@@ -1447,7 +1447,7 @@
             </w:tabs>
             <w:rPr/>
           </w:pPr>
-          <w:hyperlink w:anchor="__RefHeading___Toc11738_4195859891">
+          <w:hyperlink w:anchor="__RefHeading___Toc11738_3949650649">
             <w:r>
               <w:rPr>
                 <w:webHidden/>
@@ -1469,7 +1469,7 @@
             </w:tabs>
             <w:rPr/>
           </w:pPr>
-          <w:hyperlink w:anchor="__RefHeading___Toc11740_4195859891">
+          <w:hyperlink w:anchor="__RefHeading___Toc11740_3949650649">
             <w:r>
               <w:rPr>
                 <w:webHidden/>
@@ -1491,7 +1491,7 @@
             </w:tabs>
             <w:rPr/>
           </w:pPr>
-          <w:hyperlink w:anchor="__RefHeading___Toc11742_4195859891">
+          <w:hyperlink w:anchor="__RefHeading___Toc11742_3949650649">
             <w:r>
               <w:rPr>
                 <w:webHidden/>
@@ -1513,7 +1513,7 @@
             </w:tabs>
             <w:rPr/>
           </w:pPr>
-          <w:hyperlink w:anchor="__RefHeading___Toc11744_4195859891">
+          <w:hyperlink w:anchor="__RefHeading___Toc11744_3949650649">
             <w:r>
               <w:rPr>
                 <w:webHidden/>
@@ -1535,7 +1535,7 @@
             </w:tabs>
             <w:rPr/>
           </w:pPr>
-          <w:hyperlink w:anchor="__RefHeading___Toc11746_4195859891">
+          <w:hyperlink w:anchor="__RefHeading___Toc11746_3949650649">
             <w:r>
               <w:rPr>
                 <w:webHidden/>
@@ -1557,7 +1557,7 @@
             </w:tabs>
             <w:rPr/>
           </w:pPr>
-          <w:hyperlink w:anchor="__RefHeading___Toc11748_4195859891">
+          <w:hyperlink w:anchor="__RefHeading___Toc11748_3949650649">
             <w:r>
               <w:rPr>
                 <w:webHidden/>
@@ -1579,7 +1579,7 @@
             </w:tabs>
             <w:rPr/>
           </w:pPr>
-          <w:hyperlink w:anchor="__RefHeading___Toc11750_4195859891">
+          <w:hyperlink w:anchor="__RefHeading___Toc11750_3949650649">
             <w:r>
               <w:rPr>
                 <w:webHidden/>
@@ -1601,7 +1601,7 @@
             </w:tabs>
             <w:rPr/>
           </w:pPr>
-          <w:hyperlink w:anchor="__RefHeading___Toc11752_4195859891">
+          <w:hyperlink w:anchor="__RefHeading___Toc11752_3949650649">
             <w:r>
               <w:rPr>
                 <w:webHidden/>
@@ -1623,7 +1623,7 @@
             </w:tabs>
             <w:rPr/>
           </w:pPr>
-          <w:hyperlink w:anchor="__RefHeading___Toc11754_4195859891">
+          <w:hyperlink w:anchor="__RefHeading___Toc11754_3949650649">
             <w:r>
               <w:rPr>
                 <w:webHidden/>
@@ -1645,7 +1645,7 @@
             </w:tabs>
             <w:rPr/>
           </w:pPr>
-          <w:hyperlink w:anchor="__RefHeading___Toc11756_4195859891">
+          <w:hyperlink w:anchor="__RefHeading___Toc11756_3949650649">
             <w:r>
               <w:rPr>
                 <w:webHidden/>
@@ -1667,7 +1667,7 @@
             </w:tabs>
             <w:rPr/>
           </w:pPr>
-          <w:hyperlink w:anchor="__RefHeading___Toc11758_4195859891">
+          <w:hyperlink w:anchor="__RefHeading___Toc11758_3949650649">
             <w:r>
               <w:rPr>
                 <w:webHidden/>
@@ -1715,7 +1715,7 @@
       <w:r>
         <w:br w:type="page"/>
       </w:r>
-      <w:bookmarkStart w:id="0" w:name="__RefHeading___Toc11680_4195859891"/>
+      <w:bookmarkStart w:id="0" w:name="__RefHeading___Toc11680_3949650649"/>
       <w:bookmarkStart w:id="1" w:name="_Toc48319687"/>
       <w:bookmarkStart w:id="2" w:name="_Toc11824118"/>
       <w:bookmarkEnd w:id="0"/>
@@ -2358,7 +2358,7 @@
           <w:spacing w:val="0"/>
         </w:rPr>
       </w:pPr>
-      <w:bookmarkStart w:id="4" w:name="__RefHeading___Toc11682_4195859891"/>
+      <w:bookmarkStart w:id="4" w:name="__RefHeading___Toc11682_3949650649"/>
       <w:bookmarkStart w:id="5" w:name="_Toc233203388"/>
       <w:bookmarkEnd w:id="4"/>
       <w:r>
@@ -4216,7 +4216,7 @@
         <w:pageBreakBefore w:val="false"/>
         <w:rPr/>
       </w:pPr>
-      <w:bookmarkStart w:id="6" w:name="__RefHeading___Toc11684_4195859891"/>
+      <w:bookmarkStart w:id="6" w:name="__RefHeading___Toc11684_3949650649"/>
       <w:bookmarkEnd w:id="6"/>
       <w:r>
         <w:rPr>
@@ -4233,7 +4233,7 @@
         <w:pStyle w:val="Heading2"/>
         <w:rPr/>
       </w:pPr>
-      <w:bookmarkStart w:id="7" w:name="__RefHeading___Toc11686_4195859891"/>
+      <w:bookmarkStart w:id="7" w:name="__RefHeading___Toc11686_3949650649"/>
       <w:bookmarkEnd w:id="7"/>
       <w:r>
         <w:rPr>
@@ -4280,7 +4280,7 @@
         <w:pStyle w:val="Heading2"/>
         <w:rPr/>
       </w:pPr>
-      <w:bookmarkStart w:id="8" w:name="__RefHeading___Toc11688_4195859891"/>
+      <w:bookmarkStart w:id="8" w:name="__RefHeading___Toc11688_3949650649"/>
       <w:bookmarkEnd w:id="8"/>
       <w:r>
         <w:rPr>
@@ -4383,7 +4383,7 @@
         <w:pStyle w:val="Heading2"/>
         <w:rPr/>
       </w:pPr>
-      <w:bookmarkStart w:id="9" w:name="__RefHeading___Toc11690_4195859891"/>
+      <w:bookmarkStart w:id="9" w:name="__RefHeading___Toc11690_3949650649"/>
       <w:bookmarkEnd w:id="9"/>
       <w:r>
         <w:rPr>
@@ -4808,23 +4808,13 @@
     </w:tbl>
     <w:p>
       <w:pPr>
-        <w:pStyle w:val="Normal"/>
-        <w:spacing w:before="0" w:after="80"/>
+        <w:pStyle w:val="Heading1"/>
         <w:rPr/>
       </w:pPr>
       <w:r>
-        <w:rPr/>
-      </w:r>
-      <w:r>
         <w:br w:type="page"/>
       </w:r>
-    </w:p>
-    <w:p>
-      <w:pPr>
-        <w:pStyle w:val="Heading1"/>
-        <w:rPr/>
-      </w:pPr>
-      <w:bookmarkStart w:id="10" w:name="__RefHeading___Toc11692_4195859891"/>
+      <w:bookmarkStart w:id="10" w:name="__RefHeading___Toc11692_3949650649"/>
       <w:bookmarkEnd w:id="10"/>
       <w:r>
         <w:rPr>
@@ -4841,7 +4831,7 @@
         <w:pStyle w:val="Heading2"/>
         <w:rPr/>
       </w:pPr>
-      <w:bookmarkStart w:id="11" w:name="__RefHeading___Toc11694_4195859891"/>
+      <w:bookmarkStart w:id="11" w:name="__RefHeading___Toc11694_3949650649"/>
       <w:bookmarkEnd w:id="11"/>
       <w:r>
         <w:rPr>
@@ -6149,7 +6139,7 @@
         <w:pStyle w:val="Heading2"/>
         <w:rPr/>
       </w:pPr>
-      <w:bookmarkStart w:id="12" w:name="__RefHeading___Toc11696_4195859891"/>
+      <w:bookmarkStart w:id="12" w:name="__RefHeading___Toc11696_3949650649"/>
       <w:bookmarkEnd w:id="12"/>
       <w:r>
         <w:rPr>
@@ -7176,7 +7166,7 @@
         <w:pStyle w:val="Heading1"/>
         <w:rPr/>
       </w:pPr>
-      <w:bookmarkStart w:id="13" w:name="__RefHeading___Toc11698_4195859891"/>
+      <w:bookmarkStart w:id="13" w:name="__RefHeading___Toc11698_3949650649"/>
       <w:bookmarkEnd w:id="13"/>
       <w:r>
         <w:rPr>
@@ -7193,7 +7183,7 @@
         <w:pStyle w:val="Heading2"/>
         <w:rPr/>
       </w:pPr>
-      <w:bookmarkStart w:id="14" w:name="__RefHeading___Toc11700_4195859891"/>
+      <w:bookmarkStart w:id="14" w:name="__RefHeading___Toc11700_3949650649"/>
       <w:bookmarkEnd w:id="14"/>
       <w:r>
         <w:rPr>
@@ -8290,7 +8280,7 @@
         <w:pStyle w:val="Heading2"/>
         <w:rPr/>
       </w:pPr>
-      <w:bookmarkStart w:id="15" w:name="__RefHeading___Toc11702_4195859891"/>
+      <w:bookmarkStart w:id="15" w:name="__RefHeading___Toc11702_3949650649"/>
       <w:bookmarkEnd w:id="15"/>
       <w:r>
         <w:rPr>
@@ -9579,7 +9569,7 @@
         <w:pStyle w:val="Heading2"/>
         <w:rPr/>
       </w:pPr>
-      <w:bookmarkStart w:id="16" w:name="__RefHeading___Toc11704_4195859891"/>
+      <w:bookmarkStart w:id="16" w:name="__RefHeading___Toc11704_3949650649"/>
       <w:bookmarkEnd w:id="16"/>
       <w:r>
         <w:rPr>
@@ -9614,7 +9604,7 @@
         <w:pStyle w:val="Heading1"/>
         <w:rPr/>
       </w:pPr>
-      <w:bookmarkStart w:id="17" w:name="__RefHeading___Toc11706_4195859891"/>
+      <w:bookmarkStart w:id="17" w:name="__RefHeading___Toc11706_3949650649"/>
       <w:bookmarkEnd w:id="17"/>
       <w:r>
         <w:rPr>
@@ -9631,7 +9621,7 @@
         <w:pStyle w:val="Heading2"/>
         <w:rPr/>
       </w:pPr>
-      <w:bookmarkStart w:id="18" w:name="__RefHeading___Toc11708_4195859891"/>
+      <w:bookmarkStart w:id="18" w:name="__RefHeading___Toc11708_3949650649"/>
       <w:bookmarkEnd w:id="18"/>
       <w:r>
         <w:rPr>
@@ -11280,7 +11270,7 @@
         <w:pStyle w:val="Heading2"/>
         <w:rPr/>
       </w:pPr>
-      <w:bookmarkStart w:id="19" w:name="__RefHeading___Toc11710_4195859891"/>
+      <w:bookmarkStart w:id="19" w:name="__RefHeading___Toc11710_3949650649"/>
       <w:bookmarkEnd w:id="19"/>
       <w:r>
         <w:rPr>
@@ -11346,7 +11336,7 @@
         <w:pStyle w:val="Heading1"/>
         <w:rPr/>
       </w:pPr>
-      <w:bookmarkStart w:id="20" w:name="__RefHeading___Toc11712_4195859891"/>
+      <w:bookmarkStart w:id="20" w:name="__RefHeading___Toc11712_3949650649"/>
       <w:bookmarkEnd w:id="20"/>
       <w:r>
         <w:rPr>
@@ -11378,7 +11368,7 @@
         <w:pStyle w:val="Heading2"/>
         <w:rPr/>
       </w:pPr>
-      <w:bookmarkStart w:id="21" w:name="__RefHeading___Toc11714_4195859891"/>
+      <w:bookmarkStart w:id="21" w:name="__RefHeading___Toc11714_3949650649"/>
       <w:bookmarkEnd w:id="21"/>
       <w:r>
         <w:rPr>
@@ -11649,7 +11639,7 @@
         <w:pStyle w:val="Heading2"/>
         <w:rPr/>
       </w:pPr>
-      <w:bookmarkStart w:id="22" w:name="__RefHeading___Toc11716_4195859891"/>
+      <w:bookmarkStart w:id="22" w:name="__RefHeading___Toc11716_3949650649"/>
       <w:bookmarkEnd w:id="22"/>
       <w:r>
         <w:rPr>
@@ -12344,7 +12334,7 @@
         <w:pStyle w:val="Heading2"/>
         <w:rPr/>
       </w:pPr>
-      <w:bookmarkStart w:id="23" w:name="__RefHeading___Toc11718_4195859891"/>
+      <w:bookmarkStart w:id="23" w:name="__RefHeading___Toc11718_3949650649"/>
       <w:bookmarkEnd w:id="23"/>
       <w:r>
         <w:rPr>
@@ -12449,7 +12439,7 @@
         <w:pStyle w:val="Heading2"/>
         <w:rPr/>
       </w:pPr>
-      <w:bookmarkStart w:id="24" w:name="__RefHeading___Toc11720_4195859891"/>
+      <w:bookmarkStart w:id="24" w:name="__RefHeading___Toc11720_3949650649"/>
       <w:bookmarkEnd w:id="24"/>
       <w:r>
         <w:rPr>
@@ -12554,7 +12544,7 @@
         <w:pStyle w:val="Heading2"/>
         <w:rPr/>
       </w:pPr>
-      <w:bookmarkStart w:id="25" w:name="__RefHeading___Toc11722_4195859891"/>
+      <w:bookmarkStart w:id="25" w:name="__RefHeading___Toc11722_3949650649"/>
       <w:bookmarkEnd w:id="25"/>
       <w:r>
         <w:rPr>
@@ -12625,7 +12615,7 @@
         <w:pStyle w:val="Heading2"/>
         <w:rPr/>
       </w:pPr>
-      <w:bookmarkStart w:id="26" w:name="__RefHeading___Toc11724_4195859891"/>
+      <w:bookmarkStart w:id="26" w:name="__RefHeading___Toc11724_3949650649"/>
       <w:bookmarkEnd w:id="26"/>
       <w:r>
         <w:rPr>
@@ -12769,7 +12759,7 @@
         <w:pStyle w:val="Heading2"/>
         <w:rPr/>
       </w:pPr>
-      <w:bookmarkStart w:id="27" w:name="__RefHeading___Toc11726_4195859891"/>
+      <w:bookmarkStart w:id="27" w:name="__RefHeading___Toc11726_3949650649"/>
       <w:bookmarkEnd w:id="27"/>
       <w:r>
         <w:rPr>
@@ -12824,7 +12814,7 @@
         <w:pStyle w:val="Heading2"/>
         <w:rPr/>
       </w:pPr>
-      <w:bookmarkStart w:id="28" w:name="__RefHeading___Toc11728_4195859891"/>
+      <w:bookmarkStart w:id="28" w:name="__RefHeading___Toc11728_3949650649"/>
       <w:bookmarkEnd w:id="28"/>
       <w:r>
         <w:rPr>
@@ -12859,7 +12849,7 @@
         <w:pStyle w:val="Heading1"/>
         <w:rPr/>
       </w:pPr>
-      <w:bookmarkStart w:id="29" w:name="__RefHeading___Toc11730_4195859891"/>
+      <w:bookmarkStart w:id="29" w:name="__RefHeading___Toc11730_3949650649"/>
       <w:bookmarkEnd w:id="29"/>
       <w:r>
         <w:rPr>
@@ -12876,7 +12866,7 @@
         <w:pStyle w:val="Heading2"/>
         <w:rPr/>
       </w:pPr>
-      <w:bookmarkStart w:id="30" w:name="__RefHeading___Toc11732_4195859891"/>
+      <w:bookmarkStart w:id="30" w:name="__RefHeading___Toc11732_3949650649"/>
       <w:bookmarkEnd w:id="30"/>
       <w:r>
         <w:rPr>
@@ -13468,7 +13458,7 @@
         <w:pStyle w:val="Heading2"/>
         <w:rPr/>
       </w:pPr>
-      <w:bookmarkStart w:id="31" w:name="__RefHeading___Toc11734_4195859891"/>
+      <w:bookmarkStart w:id="31" w:name="__RefHeading___Toc11734_3949650649"/>
       <w:bookmarkEnd w:id="31"/>
       <w:r>
         <w:rPr>
@@ -13928,7 +13918,7 @@
         <w:pStyle w:val="Heading2"/>
         <w:rPr/>
       </w:pPr>
-      <w:bookmarkStart w:id="32" w:name="__RefHeading___Toc11736_4195859891"/>
+      <w:bookmarkStart w:id="32" w:name="__RefHeading___Toc11736_3949650649"/>
       <w:bookmarkEnd w:id="32"/>
       <w:r>
         <w:rPr>
@@ -14689,7 +14679,7 @@
         <w:pStyle w:val="Heading2"/>
         <w:rPr/>
       </w:pPr>
-      <w:bookmarkStart w:id="33" w:name="__RefHeading___Toc11738_4195859891"/>
+      <w:bookmarkStart w:id="33" w:name="__RefHeading___Toc11738_3949650649"/>
       <w:bookmarkEnd w:id="33"/>
       <w:r>
         <w:rPr>
@@ -15226,7 +15216,7 @@
         <w:pStyle w:val="Heading2"/>
         <w:rPr/>
       </w:pPr>
-      <w:bookmarkStart w:id="34" w:name="__RefHeading___Toc11740_4195859891"/>
+      <w:bookmarkStart w:id="34" w:name="__RefHeading___Toc11740_3949650649"/>
       <w:bookmarkEnd w:id="34"/>
       <w:r>
         <w:rPr>
@@ -15664,7 +15654,7 @@
         <w:pStyle w:val="Heading2"/>
         <w:rPr/>
       </w:pPr>
-      <w:bookmarkStart w:id="35" w:name="__RefHeading___Toc11742_4195859891"/>
+      <w:bookmarkStart w:id="35" w:name="__RefHeading___Toc11742_3949650649"/>
       <w:bookmarkEnd w:id="35"/>
       <w:r>
         <w:rPr>
@@ -16277,23 +16267,13 @@
     </w:tbl>
     <w:p>
       <w:pPr>
-        <w:pStyle w:val="Normal"/>
-        <w:spacing w:before="0" w:after="80"/>
+        <w:pStyle w:val="Heading1"/>
         <w:rPr/>
       </w:pPr>
       <w:r>
-        <w:rPr/>
-      </w:r>
-      <w:r>
         <w:br w:type="page"/>
       </w:r>
-    </w:p>
-    <w:p>
-      <w:pPr>
-        <w:pStyle w:val="Heading1"/>
-        <w:rPr/>
-      </w:pPr>
-      <w:bookmarkStart w:id="36" w:name="__RefHeading___Toc11744_4195859891"/>
+      <w:bookmarkStart w:id="36" w:name="__RefHeading___Toc11744_3949650649"/>
       <w:bookmarkEnd w:id="36"/>
       <w:r>
         <w:rPr>
@@ -17062,7 +17042,7 @@
         <w:pStyle w:val="Heading1"/>
         <w:rPr/>
       </w:pPr>
-      <w:bookmarkStart w:id="37" w:name="__RefHeading___Toc11746_4195859891"/>
+      <w:bookmarkStart w:id="37" w:name="__RefHeading___Toc11746_3949650649"/>
       <w:bookmarkEnd w:id="37"/>
       <w:r>
         <w:rPr>
@@ -18131,23 +18111,13 @@
     </w:tbl>
     <w:p>
       <w:pPr>
-        <w:pStyle w:val="Normal"/>
-        <w:spacing w:before="0" w:after="80"/>
+        <w:pStyle w:val="Heading1"/>
         <w:rPr/>
       </w:pPr>
       <w:r>
-        <w:rPr/>
-      </w:r>
-      <w:r>
         <w:br w:type="page"/>
       </w:r>
-    </w:p>
-    <w:p>
-      <w:pPr>
-        <w:pStyle w:val="Heading1"/>
-        <w:rPr/>
-      </w:pPr>
-      <w:bookmarkStart w:id="38" w:name="__RefHeading___Toc11748_4195859891"/>
+      <w:bookmarkStart w:id="38" w:name="__RefHeading___Toc11748_3949650649"/>
       <w:bookmarkEnd w:id="38"/>
       <w:r>
         <w:rPr>
@@ -20968,23 +20938,13 @@
     </w:tbl>
     <w:p>
       <w:pPr>
-        <w:pStyle w:val="Normal"/>
-        <w:spacing w:before="0" w:after="80"/>
+        <w:pStyle w:val="Heading1"/>
         <w:rPr/>
       </w:pPr>
       <w:r>
-        <w:rPr/>
-      </w:r>
-      <w:r>
         <w:br w:type="page"/>
       </w:r>
-    </w:p>
-    <w:p>
-      <w:pPr>
-        <w:pStyle w:val="Heading1"/>
-        <w:rPr/>
-      </w:pPr>
-      <w:bookmarkStart w:id="39" w:name="__RefHeading___Toc11750_4195859891"/>
+      <w:bookmarkStart w:id="39" w:name="__RefHeading___Toc11750_3949650649"/>
       <w:bookmarkEnd w:id="39"/>
       <w:r>
         <w:rPr>
@@ -21001,7 +20961,7 @@
         <w:pStyle w:val="Heading2"/>
         <w:rPr/>
       </w:pPr>
-      <w:bookmarkStart w:id="40" w:name="__RefHeading___Toc11752_4195859891"/>
+      <w:bookmarkStart w:id="40" w:name="__RefHeading___Toc11752_3949650649"/>
       <w:bookmarkEnd w:id="40"/>
       <w:r>
         <w:rPr>
@@ -21995,7 +21955,7 @@
         <w:pStyle w:val="Heading2"/>
         <w:rPr/>
       </w:pPr>
-      <w:bookmarkStart w:id="41" w:name="__RefHeading___Toc11754_4195859891"/>
+      <w:bookmarkStart w:id="41" w:name="__RefHeading___Toc11754_3949650649"/>
       <w:bookmarkEnd w:id="41"/>
       <w:r>
         <w:rPr>
@@ -22978,7 +22938,7 @@
         <w:pStyle w:val="Heading1"/>
         <w:rPr/>
       </w:pPr>
-      <w:bookmarkStart w:id="42" w:name="__RefHeading___Toc11756_4195859891"/>
+      <w:bookmarkStart w:id="42" w:name="__RefHeading___Toc11756_3949650649"/>
       <w:bookmarkEnd w:id="42"/>
       <w:r>
         <w:rPr>
@@ -23069,7 +23029,7 @@
           <w:spacing w:val="0"/>
         </w:rPr>
       </w:pPr>
-      <w:bookmarkStart w:id="43" w:name="__RefHeading___Toc11758_4195859891"/>
+      <w:bookmarkStart w:id="43" w:name="__RefHeading___Toc11758_3949650649"/>
       <w:bookmarkStart w:id="44" w:name="_Toc233203395"/>
       <w:bookmarkEnd w:id="43"/>
       <w:r>

</xml_diff>